<commit_message>
Add part about unit testing
</commit_message>
<xml_diff>
--- a/Task 1 WriteUp - Jeroen Buil.docx
+++ b/Task 1 WriteUp - Jeroen Buil.docx
@@ -4,7 +4,7 @@
   <w:body>
     <w:p>
       <w:pPr>
-        <w:pStyle w:val="864"/>
+        <w:pStyle w:val="868"/>
         <w:pBdr/>
         <w:spacing/>
         <w:ind/>
@@ -31,7 +31,7 @@
     </w:p>
     <w:p>
       <w:pPr>
-        <w:pStyle w:val="866"/>
+        <w:pStyle w:val="870"/>
         <w:pBdr/>
         <w:spacing/>
         <w:ind/>
@@ -46,25 +46,64 @@
         <w:t xml:space="preserve">Jeroen Buil</w:t>
       </w:r>
       <w:r>
+        <w:rPr>
+          <w:lang w:val="en-US"/>
+        </w:rPr>
+      </w:r>
+      <w:r>
+        <w:rPr>
+          <w:lang w:val="en-US"/>
+        </w:rPr>
+      </w:r>
+    </w:p>
+    <w:p>
+      <w:pPr>
+        <w:pStyle w:val="849"/>
+        <w:pBdr/>
+        <w:spacing/>
+        <w:ind/>
         <w:rPr>
           <w:highlight w:val="none"/>
           <w:lang w:val="en-US"/>
         </w:rPr>
-      </w:r>
-      <w:r>
-        <w:rPr>
+      </w:pPr>
+      <w:r>
+        <w:rPr>
+          <w:lang w:val="en-US"/>
+        </w:rPr>
+        <w:t xml:space="preserve">Task 1</w:t>
+      </w:r>
+      <w:r>
+        <w:rPr>
+          <w:lang w:val="en-US"/>
+        </w:rPr>
+        <w:t xml:space="preserve">: </w:t>
+      </w:r>
+      <w:r>
+        <w:rPr>
+          <w:lang w:val="en-US"/>
+        </w:rPr>
+        <w:t xml:space="preserve">Web (Vue 3): Fast Periodic Visual Stimulation</w:t>
+      </w:r>
+      <w:r>
+        <w:rPr>
+          <w:highlight w:val="none"/>
+          <w:lang w:val="en-US"/>
+        </w:rPr>
+      </w:r>
+      <w:r>
+        <w:rPr>
+          <w:highlight w:val="none"/>
           <w:lang w:val="en-US"/>
         </w:rPr>
       </w:r>
     </w:p>
     <w:p>
       <w:pPr>
-        <w:pStyle w:val="845"/>
-        <w:pBdr/>
-        <w:spacing/>
-        <w:ind/>
-        <w:rPr>
-          <w:highlight w:val="none"/>
+        <w:pBdr/>
+        <w:spacing/>
+        <w:ind/>
+        <w:rPr>
           <w:lang w:val="en-US"/>
         </w:rPr>
       </w:pPr>
@@ -72,91 +111,93 @@
         <w:rPr>
           <w:lang w:val="en-US"/>
         </w:rPr>
-        <w:t xml:space="preserve">Task 1</w:t>
       </w:r>
       <w:r>
         <w:rPr>
           <w:lang w:val="en-US"/>
         </w:rPr>
-        <w:t xml:space="preserve">: </w:t>
-      </w:r>
-      <w:r>
-        <w:rPr>
-          <w:lang w:val="en-US"/>
-        </w:rPr>
-        <w:t xml:space="preserve">Web (Vue 3): Fast Periodic Visual Stimulation</w:t>
-      </w:r>
-      <w:r>
-        <w:rPr>
-          <w:lang w:val="en-US"/>
-        </w:rPr>
-      </w:r>
-      <w:r>
-        <w:rPr>
-          <w:highlight w:val="none"/>
+      </w:r>
+      <w:r>
+        <w:rPr>
           <w:lang w:val="en-US"/>
         </w:rPr>
       </w:r>
     </w:p>
     <w:p>
       <w:pPr>
-        <w:pBdr/>
-        <w:spacing/>
-        <w:ind/>
+        <w:pStyle w:val="850"/>
+        <w:pBdr/>
+        <w:spacing/>
+        <w:ind/>
+        <w:rPr>
+          <w:highlight w:val="none"/>
+          <w:lang w:val="en-US" w:bidi="en-US"/>
+        </w:rPr>
+      </w:pPr>
+      <w:r>
+        <w:rPr>
+          <w:highlight w:val="none"/>
+          <w:lang w:val="en-US" w:bidi="en-US"/>
+        </w:rPr>
+        <w:t xml:space="preserve">Approach to get timing right:</w:t>
+      </w:r>
+      <w:r>
         <w:rPr>
           <w:lang w:val="en-US"/>
         </w:rPr>
-      </w:pPr>
-      <w:r>
-        <w:rPr>
-          <w:lang w:val="en-US"/>
-        </w:rPr>
-      </w:r>
-      <w:r>
-        <w:rPr>
-          <w:lang w:val="en-US"/>
-        </w:rPr>
-      </w:r>
-      <w:r>
-        <w:rPr>
-          <w:lang w:val="en-US"/>
+        <w:t xml:space="preserve"> rAF</w:t>
+      </w:r>
+      <w:r>
+        <w:rPr>
+          <w:highlight w:val="none"/>
+          <w:lang w:val="en-US" w:bidi="en-US"/>
+        </w:rPr>
+      </w:r>
+      <w:r>
+        <w:rPr>
+          <w:highlight w:val="none"/>
+          <w:lang w:val="en-US" w:bidi="en-US"/>
         </w:rPr>
       </w:r>
     </w:p>
     <w:p>
       <w:pPr>
-        <w:pStyle w:val="846"/>
-        <w:pBdr/>
-        <w:spacing/>
-        <w:ind/>
-        <w:rPr>
-          <w:highlight w:val="none"/>
+        <w:pBdr/>
+        <w:spacing/>
+        <w:ind/>
+        <w:rPr>
           <w:lang w:val="en-US" w:bidi="en-US"/>
-        </w:rPr>
-      </w:pPr>
-      <w:r>
-        <w:rPr>
-          <w:highlight w:val="none"/>
+          <w14:ligatures w14:val="none"/>
+        </w:rPr>
+      </w:pPr>
+      <w:r>
+        <w:rPr>
           <w:lang w:val="en-US" w:bidi="en-US"/>
         </w:rPr>
-        <w:t xml:space="preserve">Approach to get timing right:</w:t>
-      </w:r>
-      <w:r>
-        <w:rPr>
-          <w:lang w:val="en-US"/>
-        </w:rPr>
-        <w:t xml:space="preserve"> rAF</w:t>
-      </w:r>
-      <w:r>
-        <w:rPr>
-          <w:highlight w:val="none"/>
+        <w:t xml:space="preserve">Using timers like setTimeout/setInterval are obviously not the right way to approach a use-case like this. Due to overhead and system usage you simply cannot assure tha</w:t>
+      </w:r>
+      <w:r>
+        <w:rPr>
           <w:lang w:val="en-US" w:bidi="en-US"/>
         </w:rPr>
-      </w:r>
-      <w:r>
-        <w:rPr>
-          <w:highlight w:val="none"/>
+        <w:t xml:space="preserve">t EXACTLY that the timeout starts and ends when intended and the timeout t</w:t>
+      </w:r>
+      <w:r>
+        <w:rPr>
           <w:lang w:val="en-US" w:bidi="en-US"/>
+        </w:rPr>
+        <w:t xml:space="preserve">he stimuli picture is displayed at the correct moment. In practice these timers accumulate, meanin each delay causes a further drift away from the actual moment you wish to display a stimuli; the longer the sequence the larger the drift at the end will be.</w:t>
+      </w:r>
+      <w:r>
+        <w:rPr>
+          <w:lang w:val="en-US" w:bidi="en-US"/>
+          <w14:ligatures w14:val="none"/>
+        </w:rPr>
+      </w:r>
+      <w:r>
+        <w:rPr>
+          <w:lang w:val="en-US" w:bidi="en-US"/>
+          <w14:ligatures w14:val="none"/>
         </w:rPr>
       </w:r>
     </w:p>
@@ -174,52 +215,24 @@
         <w:rPr>
           <w:lang w:val="en-US" w:bidi="en-US"/>
         </w:rPr>
-        <w:t xml:space="preserve">Using timers like setTimeout/setInterval are obviously not the right way to approach a use-case like this. Due to overhead and system usage you simply cannot assure tha</w:t>
+        <w:t xml:space="preserve">Instead I am relying on requestAnimationFrames (rAFs), which tell the browser that you wi</w:t>
       </w:r>
       <w:r>
         <w:rPr>
           <w:lang w:val="en-US" w:bidi="en-US"/>
         </w:rPr>
-        <w:t xml:space="preserve">t EXACTLY that the timeout starts and ends when intended and the timeout the stimuli picture is displayed at the correct moment. In practice these timers accumulate, meanin each delay causes a further drift away from the actual moment you wish to display a stimuli; the longer the sequence the larger the drift at the end will be.</w:t>
+        <w:t xml:space="preserve">sh </w:t>
       </w:r>
       <w:r>
         <w:rPr>
           <w:lang w:val="en-US" w:bidi="en-US"/>
         </w:rPr>
+        <w:t xml:space="preserve">to perform an action and instruct the browser to do this before the next frame is repainted. Such rAF callbacks are synced to a browser’s actual display refresh (typically ~60 Hz / 16.67 ms/frame ) and unlike timers mentioned before, they don’t accumulate.</w:t>
       </w:r>
       <w:r>
         <w:rPr>
           <w:lang w:val="en-US" w:bidi="en-US"/>
           <w14:ligatures w14:val="none"/>
-        </w:rPr>
-      </w:r>
-    </w:p>
-    <w:p>
-      <w:pPr>
-        <w:pBdr/>
-        <w:spacing/>
-        <w:ind/>
-        <w:rPr>
-          <w:lang w:val="en-US" w:bidi="en-US"/>
-          <w14:ligatures w14:val="none"/>
-        </w:rPr>
-      </w:pPr>
-      <w:r>
-        <w:rPr>
-          <w:lang w:val="en-US" w:bidi="en-US"/>
-        </w:rPr>
-        <w:t xml:space="preserve">Instead I am relying on requestAnimationFrames (rAFs), which tell the browser that you wi</w:t>
-      </w:r>
-      <w:r>
-        <w:rPr>
-          <w:lang w:val="en-US" w:bidi="en-US"/>
-        </w:rPr>
-        <w:t xml:space="preserve">sh to perform an action and instruct the browser to do this before the next frame is repainted. Such rAF callbacks are synced to a browser’s actual display refresh (typically ~60 Hz / 16.67 ms/frame ) and unlike timers mentioned before, they don’t accumulate.</w:t>
-      </w:r>
-      <w:r>
-        <w:rPr>
-          <w:highlight w:val="none"/>
-          <w:lang w:val="en-US" w:bidi="en-US"/>
         </w:rPr>
       </w:r>
       <w:r>
@@ -250,12 +263,19 @@
         <w:rPr>
           <w:lang w:val="en-US" w:bidi="en-US"/>
         </w:rPr>
-        <w:t xml:space="preserve"> to reduce the compute needed when nothing is happening in the webapp and can be used e.g. to make animations run smoother (because you only perform them (and their underlying actions as many times as the frames are actually updating). In the use ase of a visual experiement, rAFs can also be used to monitor when a frame is updated and display the stimuli at that exact moment (and additionally log when this happens).</w:t>
+        <w:t xml:space="preserve"> to reduce the compute needed when nothing is happening in the webapp and can be used e.g. to make animations run smoother (because you only perform them (and thei</w:t>
+      </w:r>
+      <w:r>
+        <w:rPr>
+          <w:lang w:val="en-US" w:bidi="en-US"/>
+        </w:rPr>
+        <w:t xml:space="preserve">r underlying actions as many times as the frames are actually updating). In the use ase of a visual experiement, rAFs can also be used to monitor when a frame is updated and display the stimuli at that exact moment (and additionally log when this happens).</w:t>
       </w:r>
       <w:r>
         <w:rPr>
           <w:highlight w:val="none"/>
           <w:lang w:val="en-US" w:bidi="en-US"/>
+          <w14:ligatures w14:val="none"/>
         </w:rPr>
       </w:r>
       <w:r>
@@ -298,6 +318,8 @@
           <w:b/>
           <w:bCs/>
           <w:highlight w:val="none"/>
+          <w:lang w:val="en-US" w:bidi="en-US"/>
+          <w14:ligatures w14:val="none"/>
         </w:rPr>
       </w:r>
       <w:r>
@@ -338,6 +360,7 @@
           <w:bCs w:val="0"/>
           <w:highlight w:val="none"/>
           <w:lang w:val="en-US" w:bidi="en-US"/>
+          <w14:ligatures w14:val="none"/>
         </w:rPr>
       </w:r>
       <w:r>
@@ -378,6 +401,7 @@
           <w:bCs w:val="0"/>
           <w:highlight w:val="none"/>
           <w:lang w:val="en-US" w:bidi="en-US"/>
+          <w14:ligatures w14:val="none"/>
         </w:rPr>
       </w:r>
       <w:r>
@@ -392,7 +416,7 @@
     </w:p>
     <w:p>
       <w:pPr>
-        <w:pStyle w:val="908"/>
+        <w:pStyle w:val="912"/>
         <w:numPr>
           <w:ilvl w:val="0"/>
           <w:numId w:val="6"/>
@@ -423,6 +447,7 @@
           <w:bCs w:val="0"/>
           <w:highlight w:val="none"/>
           <w:lang w:val="en-US" w:bidi="en-US"/>
+          <w14:ligatures w14:val="none"/>
         </w:rPr>
       </w:r>
       <w:r>
@@ -437,7 +462,7 @@
     </w:p>
     <w:p>
       <w:pPr>
-        <w:pStyle w:val="908"/>
+        <w:pStyle w:val="912"/>
         <w:numPr>
           <w:ilvl w:val="0"/>
           <w:numId w:val="6"/>
@@ -468,6 +493,7 @@
           <w:bCs w:val="0"/>
           <w:highlight w:val="none"/>
           <w:lang w:val="en-US" w:bidi="en-US"/>
+          <w14:ligatures w14:val="none"/>
         </w:rPr>
       </w:r>
       <w:r>
@@ -482,7 +508,7 @@
     </w:p>
     <w:p>
       <w:pPr>
-        <w:pStyle w:val="908"/>
+        <w:pStyle w:val="912"/>
         <w:numPr>
           <w:ilvl w:val="0"/>
           <w:numId w:val="6"/>
@@ -511,6 +537,7 @@
           <w:bCs w:val="0"/>
           <w:highlight w:val="none"/>
           <w:lang w:val="en-US" w:bidi="en-US"/>
+          <w14:ligatures w14:val="none"/>
         </w:rPr>
       </w:r>
       <w:r>
@@ -525,7 +552,7 @@
     </w:p>
     <w:p>
       <w:pPr>
-        <w:pStyle w:val="908"/>
+        <w:pStyle w:val="912"/>
         <w:numPr>
           <w:ilvl w:val="0"/>
           <w:numId w:val="6"/>
@@ -550,12 +577,6 @@
       </w:r>
       <w:r>
         <w:rPr>
-          <w:highlight w:val="none"/>
-          <w:lang w:val="en-US" w:bidi="en-US"/>
-        </w:rPr>
-      </w:r>
-      <w:r>
-        <w:rPr>
           <w:b w:val="0"/>
           <w:bCs w:val="0"/>
           <w:highlight w:val="none"/>
@@ -563,6 +584,15 @@
           <w14:ligatures w14:val="none"/>
         </w:rPr>
       </w:r>
+      <w:r>
+        <w:rPr>
+          <w:b w:val="0"/>
+          <w:bCs w:val="0"/>
+          <w:highlight w:val="none"/>
+          <w:lang w:val="en-US" w:bidi="en-US"/>
+          <w14:ligatures w14:val="none"/>
+        </w:rPr>
+      </w:r>
     </w:p>
     <w:p>
       <w:pPr>
@@ -590,7 +620,7 @@
           <w:b w:val="0"/>
           <w:bCs w:val="0"/>
           <w:highlight w:val="none"/>
-          <w:lang w:val="en-US" w:bidi="en-US"/>
+          <w14:ligatures w14:val="none"/>
         </w:rPr>
       </w:r>
       <w:r>
@@ -2659,31 +2689,6 @@
           <w:szCs w:val="14"/>
         </w:rPr>
       </w:r>
-      <w:r>
-        <w:rPr>
-          <w:rFonts w:ascii="Droid Sans Mono" w:hAnsi="Droid Sans Mono" w:eastAsia="Droid Sans Mono" w:cs="Droid Sans Mono"/>
-          <w:sz w:val="14"/>
-          <w:szCs w:val="14"/>
-        </w:rPr>
-      </w:r>
-      <w:r>
-        <w:rPr>
-          <w:sz w:val="14"/>
-          <w:szCs w:val="14"/>
-        </w:rPr>
-      </w:r>
-      <w:r>
-        <w:rPr>
-          <w:sz w:val="14"/>
-          <w:szCs w:val="14"/>
-        </w:rPr>
-      </w:r>
-      <w:r>
-        <w:rPr>
-          <w:sz w:val="14"/>
-          <w:szCs w:val="14"/>
-        </w:rPr>
-      </w:r>
     </w:p>
     <w:p>
       <w:pPr>
@@ -2814,7 +2819,6 @@
       </w:r>
       <w:r>
         <w:rPr>
-          <w:rFonts w:ascii="Droid Sans Mono" w:hAnsi="Droid Sans Mono" w:eastAsia="Droid Sans Mono" w:cs="Droid Sans Mono"/>
           <w:sz w:val="14"/>
           <w:szCs w:val="14"/>
         </w:rPr>
@@ -3404,6 +3408,7 @@
       <w:r>
         <w:rPr>
           <w:lang w:val="en-US" w:bidi="en-US"/>
+          <w14:ligatures w14:val="none"/>
         </w:rPr>
       </w:r>
       <w:r>
@@ -3415,7 +3420,7 @@
     </w:p>
     <w:p>
       <w:pPr>
-        <w:pStyle w:val="846"/>
+        <w:pStyle w:val="850"/>
         <w:pBdr/>
         <w:spacing/>
         <w:ind/>
@@ -3442,6 +3447,7 @@
           <w:bCs/>
           <w:highlight w:val="none"/>
           <w:lang w:val="en-US" w:bidi="en-US"/>
+          <w14:ligatures w14:val="none"/>
         </w:rPr>
       </w:r>
       <w:r>
@@ -3474,7 +3480,13 @@
         <w:rPr>
           <w:lang w:val="en-US" w:bidi="en-US"/>
         </w:rPr>
-        <w:t xml:space="preserve">al difference between the mean interval and the target rate, with a small standard deviation (&lt;1ms). This applies to both the random base stimuli as the oddball stimuli (every N-th frame). </w:t>
+        <w:t xml:space="preserve">al difference between the mean interval and the target rate, with a small standard deviation (&lt;1ms). This applies to b</w:t>
+      </w:r>
+      <w:r>
+        <w:rPr>
+          <w:lang w:val="en-US" w:bidi="en-US"/>
+        </w:rPr>
+        <w:t xml:space="preserve">oth the random base stimuli as the oddball stimuli (every N-th frame). </w:t>
         <w:br/>
         <w:t xml:space="preserve">Additionally, no dropped stimuli are observed, which would be disastrous for an experiment if the user misses a stimuli because the browser was lagging.</w:t>
         <w:br/>
@@ -3496,20 +3508,20 @@
       </w:r>
       <w:r>
         <w:rPr>
-          <w:highlight w:val="none"/>
-          <w:lang w:val="en-US" w:bidi="en-US"/>
-        </w:rPr>
-      </w:r>
-      <w:r>
-        <w:rPr>
           <w:lang w:val="en-US" w:bidi="en-US"/>
           <w14:ligatures w14:val="none"/>
         </w:rPr>
       </w:r>
+      <w:r>
+        <w:rPr>
+          <w:lang w:val="en-US" w:bidi="en-US"/>
+          <w14:ligatures w14:val="none"/>
+        </w:rPr>
+      </w:r>
     </w:p>
     <w:p>
       <w:pPr>
-        <w:pStyle w:val="908"/>
+        <w:pStyle w:val="912"/>
         <w:numPr>
           <w:ilvl w:val="0"/>
           <w:numId w:val="10"/>
@@ -3636,7 +3648,7 @@
     </w:p>
     <w:p>
       <w:pPr>
-        <w:pStyle w:val="908"/>
+        <w:pStyle w:val="912"/>
         <w:numPr>
           <w:ilvl w:val="0"/>
           <w:numId w:val="7"/>
@@ -3683,20 +3695,34 @@
           <w:highlight w:val="none"/>
           <w:lang w:val="en-US" w:bidi="en-US"/>
         </w:rPr>
-        <w:t xml:space="preserve">pproach ensures that a stimuli is never displayed too early, the min interval are still lower than the target interval rate. This may seem counter intuitive, but this is not a bug. This can happen when e.g. one stimulus is delayed and the next one is perfectly on time, causing a delta that is smaller than the</w:t>
-      </w:r>
-      <w:r>
-        <w:rPr>
-          <w:lang w:val="en-US" w:bidi="en-US"/>
-        </w:rPr>
-        <w:t xml:space="preserve"> target.</w:t>
+        <w:t xml:space="preserve">pproach ensures that a stimuli is never displayed too </w:t>
       </w:r>
       <w:r>
         <w:rPr>
           <w:highlight w:val="none"/>
           <w:lang w:val="en-US" w:bidi="en-US"/>
         </w:rPr>
+        <w:t xml:space="preserve">early, the min interval are still lower than the target interval rate. This may seem counter intuitive, but this is not a bug. This can happen when e.g. one stimulus is delayed and the next one is perfectly on time, causing a delta that is smaller than the</w:t>
+      </w:r>
+      <w:r>
+        <w:rPr>
+          <w:lang w:val="en-US" w:bidi="en-US"/>
+        </w:rPr>
+        <w:t xml:space="preserve"> target.</w:t>
+      </w:r>
+      <w:r>
+        <w:rPr>
+          <w:highlight w:val="none"/>
+          <w:lang w:val="en-US" w:bidi="en-US"/>
+        </w:rPr>
         <w:t xml:space="preserve"> These variations luckily are small (in the order of 1 std).</w:t>
+      </w:r>
+      <w:r>
+        <w:rPr>
+          <w:highlight w:val="none"/>
+          <w:lang w:val="en-US" w:bidi="en-US"/>
+          <w14:ligatures w14:val="none"/>
+        </w:rPr>
       </w:r>
       <w:r>
         <w:rPr>
@@ -3791,7 +3817,7 @@
       </w:r>
       <w:r>
         <w:rPr>
-          <w:lang w:val="en-US"/>
+          <w:lang w:val="en-US" w:bidi="en-US"/>
         </w:rPr>
       </w:r>
       <w:r>
@@ -3802,7 +3828,7 @@
     </w:p>
     <w:p>
       <w:pPr>
-        <w:pStyle w:val="883"/>
+        <w:pStyle w:val="887"/>
         <w:pBdr/>
         <w:spacing/>
         <w:ind/>
@@ -3826,7 +3852,13 @@
         <w:rPr>
           <w:lang w:val="en-US"/>
         </w:rPr>
-        <w:t xml:space="preserve">: Interval and dropped stimuli stats. Run setup shows the meta data from the current sequence run settings. The intervals are split between All (both base and oddball stimuli) and only the oddball stimuli. Dropped stimuli indicates any dropped stimuli (e.g. due to lag), which did not happen during any of the test runs.</w:t>
+        <w:t xml:space="preserve">: Interval and dropped stimuli stats. Run setup shows the meta d</w:t>
+      </w:r>
+      <w:r>
+        <w:rPr>
+          <w:lang w:val="en-US"/>
+        </w:rPr>
+        <w:t xml:space="preserve">ata from the current sequence run settings. The intervals are split between All (both base and oddball stimuli) and only the oddball stimuli. Dropped stimuli indicates any dropped stimuli (e.g. due to lag), which did not happen during any of the test runs.</w:t>
       </w:r>
       <w:r/>
     </w:p>
@@ -3836,7 +3868,7 @@
         <w:spacing/>
         <w:ind/>
         <w:rPr>
-          <w:rStyle w:val="856"/>
+          <w:rStyle w:val="860"/>
           <w:highlight w:val="none"/>
           <w:lang w:val="en-US" w:bidi="en-US"/>
           <w14:ligatures w14:val="none"/>
@@ -3918,22 +3950,24 @@
       </w:r>
       <w:r>
         <w:rPr>
-          <w:rStyle w:val="856"/>
-          <w:lang w:val="en-US" w:bidi="en-US"/>
-        </w:rPr>
-      </w:r>
-      <w:r>
-        <w:rPr>
-          <w:rStyle w:val="856"/>
+          <w:rStyle w:val="860"/>
           <w:highlight w:val="none"/>
           <w:lang w:val="en-US" w:bidi="en-US"/>
           <w14:ligatures w14:val="none"/>
         </w:rPr>
       </w:r>
+      <w:r>
+        <w:rPr>
+          <w:rStyle w:val="860"/>
+          <w:highlight w:val="none"/>
+          <w:lang w:val="en-US" w:bidi="en-US"/>
+          <w14:ligatures w14:val="none"/>
+        </w:rPr>
+      </w:r>
     </w:p>
     <w:p>
       <w:pPr>
-        <w:pStyle w:val="883"/>
+        <w:pStyle w:val="887"/>
         <w:pBdr/>
         <w:spacing/>
         <w:ind/>
@@ -3967,14 +4001,14 @@
         <w:spacing/>
         <w:ind/>
         <w:rPr>
-          <w:rStyle w:val="856"/>
+          <w:rStyle w:val="860"/>
           <w:lang w:val="en-US" w:bidi="en-US"/>
           <w14:ligatures w14:val="none"/>
         </w:rPr>
       </w:pPr>
       <w:r>
         <w:rPr>
-          <w:rStyle w:val="856"/>
+          <w:rStyle w:val="860"/>
           <w:highlight w:val="none"/>
           <w:lang w:val="en-US" w:bidi="en-US"/>
         </w:rPr>
@@ -4050,22 +4084,22 @@
       </w:r>
       <w:r>
         <w:rPr>
-          <w:rStyle w:val="856"/>
-          <w:highlight w:val="none"/>
-          <w:lang w:val="en-US" w:bidi="en-US"/>
-        </w:rPr>
-      </w:r>
-      <w:r>
-        <w:rPr>
-          <w:rStyle w:val="856"/>
+          <w:rStyle w:val="860"/>
           <w:lang w:val="en-US" w:bidi="en-US"/>
           <w14:ligatures w14:val="none"/>
         </w:rPr>
       </w:r>
+      <w:r>
+        <w:rPr>
+          <w:rStyle w:val="860"/>
+          <w:lang w:val="en-US" w:bidi="en-US"/>
+          <w14:ligatures w14:val="none"/>
+        </w:rPr>
+      </w:r>
     </w:p>
     <w:p>
       <w:pPr>
-        <w:pStyle w:val="883"/>
+        <w:pStyle w:val="887"/>
         <w:pBdr/>
         <w:spacing/>
         <w:ind/>
@@ -4105,23 +4139,22 @@
       </w:pPr>
       <w:r>
         <w:rPr>
-          <w:rStyle w:val="856"/>
+          <w:rStyle w:val="860"/>
           <w:highlight w:val="none"/>
           <w:lang w:val="en-US" w:bidi="en-US"/>
         </w:rPr>
       </w:r>
       <w:r>
         <w:rPr>
-          <w:rStyle w:val="856"/>
+          <w:rStyle w:val="860"/>
           <w:highlight w:val="none"/>
           <w:lang w:val="en-US" w:bidi="en-US"/>
         </w:rPr>
       </w:r>
       <w:r>
         <w:rPr>
-          <w:rStyle w:val="856"/>
           <w:highlight w:val="none"/>
-          <w:lang w:val="en-US" w:bidi="en-US"/>
+          <w14:ligatures w14:val="none"/>
         </w:rPr>
       </w:r>
     </w:p>
@@ -4131,7 +4164,7 @@
         <w:spacing/>
         <w:ind/>
         <w:rPr>
-          <w:rStyle w:val="856"/>
+          <w:rStyle w:val="860"/>
           <w:highlight w:val="none"/>
           <w:lang w:val="en-US" w:bidi="en-US"/>
           <w14:ligatures w14:val="none"/>
@@ -4139,15 +4172,10 @@
       </w:pPr>
       <w:r>
         <w:rPr>
-          <w:rStyle w:val="856"/>
+          <w:rStyle w:val="860"/>
           <w:lang w:val="en-US" w:bidi="en-US"/>
         </w:rPr>
         <w:t xml:space="preserve">Ways to improve and known limits:</w:t>
-      </w:r>
-      <w:r>
-        <w:rPr>
-          <w:highlight w:val="none"/>
-        </w:rPr>
       </w:r>
       <w:r>
         <w:rPr>
@@ -4155,10 +4183,18 @@
           <w14:ligatures w14:val="none"/>
         </w:rPr>
       </w:r>
+      <w:r>
+        <w:rPr>
+          <w:rStyle w:val="860"/>
+          <w:highlight w:val="none"/>
+          <w:lang w:val="en-US" w:bidi="en-US"/>
+          <w14:ligatures w14:val="none"/>
+        </w:rPr>
+      </w:r>
     </w:p>
     <w:p>
       <w:pPr>
-        <w:pStyle w:val="908"/>
+        <w:pStyle w:val="912"/>
         <w:numPr>
           <w:ilvl w:val="0"/>
           <w:numId w:val="5"/>
@@ -4200,7 +4236,14 @@
           <w:highlight w:val="none"/>
           <w:lang w:val="en-US" w:bidi="en-US"/>
         </w:rPr>
-        <w:t xml:space="preserve"> interval plot show this behaviour as the first interval is higher than the subsequent ones. This effect is small, but not negligable and could become a bigger problem with bigger and more stimuli files. This performance dropped could be improved by preloading the images once before starting the loop, putting them in cache. </w:t>
+        <w:t xml:space="preserve"> interval plot show this behaviour as the first interval is higher than the subsequent ones. This effect is small, but not negligable and could become a bigger problem with bigger and more stimuli files.</w:t>
+      </w:r>
+      <w:r>
+        <w:rPr>
+          <w:highlight w:val="none"/>
+          <w:lang w:val="en-US" w:bidi="en-US"/>
+        </w:rPr>
+        <w:t xml:space="preserve"> This performance dropped could be improved by preloading the images once before starting the loop, putting them in cache. </w:t>
         <w:br/>
         <w:t xml:space="preserve">I consider this a ‘could’ve, would’ve, should’ve’, if this was a real world project, but for this assignment I left it out of scope.</w:t>
       </w:r>
@@ -4221,7 +4264,7 @@
     </w:p>
     <w:p>
       <w:pPr>
-        <w:pStyle w:val="908"/>
+        <w:pStyle w:val="912"/>
         <w:numPr>
           <w:ilvl w:val="0"/>
           <w:numId w:val="5"/>
@@ -4259,7 +4302,7 @@
           <w:lang w:val="en-US" w:bidi="en-US"/>
           <w14:ligatures w14:val="none"/>
         </w:rPr>
-        <w:t xml:space="preserve"> With a base rate of 6 Hz (166.67ms) and a screen refresh of 60Hz (16.67 ms), this means theoretically exactly 10 frames can be displayed, hence the very low interval jitter. If we would use a base rate that is less dividable with the refresh rate, this jitter could increase up to 16.67 in the worst case. This is an inherent limitation that can only be solved by somehow increasing the refresh rate of the app.</w:t>
+        <w:t xml:space="preserve"> With a base rate of 6 Hz (166.67ms) and a screen refresh of 60Hz (16.67 ms), this means theoretically exactly 10 frames can be displayed, hence the very lo</w:t>
       </w:r>
       <w:r>
         <w:rPr>
@@ -4267,11 +4310,26 @@
           <w:lang w:val="en-US" w:bidi="en-US"/>
           <w14:ligatures w14:val="none"/>
         </w:rPr>
+        <w:t xml:space="preserve">w interval jitter. If we would use a base rate that is less dividable with the refresh rate, this jitter could increase up to 16.67 in the worst case. This is an inherent limitation that can only be solved by somehow increasing the refresh rate of the app.</w:t>
+      </w:r>
+      <w:r>
+        <w:rPr>
+          <w:highlight w:val="none"/>
+          <w:lang w:val="en-US" w:bidi="en-US"/>
+          <w14:ligatures w14:val="none"/>
+        </w:rPr>
+      </w:r>
+      <w:r>
+        <w:rPr>
+          <w:highlight w:val="none"/>
+          <w:lang w:val="en-US" w:bidi="en-US"/>
+          <w14:ligatures w14:val="none"/>
+        </w:rPr>
       </w:r>
     </w:p>
     <w:p>
       <w:pPr>
-        <w:pStyle w:val="908"/>
+        <w:pStyle w:val="912"/>
         <w:numPr>
           <w:ilvl w:val="0"/>
           <w:numId w:val="5"/>
@@ -4314,7 +4372,17 @@
           <w:lang w:val="en-US" w:bidi="en-US"/>
           <w14:ligatures w14:val="none"/>
         </w:rPr>
-        <w:t xml:space="preserve">ttle or even pause the activity of this webapp tab (e.g. when minimised) or when the CPU load spikes for whatever reason, this can delay a frame, or even pause the rAF entirely. These risks are harder to control, but can be reduced by good computer management (not have many tabs and other programs open) and code optimisation.</w:t>
+        <w:t xml:space="preserve">ttle or even pause the activity of this webapp tab (e.g. when minimised</w:t>
+      </w:r>
+      <w:r>
+        <w:rPr>
+          <w:b w:val="0"/>
+          <w:bCs w:val="0"/>
+          <w:highlight w:val="none"/>
+          <w:lang w:val="en-US" w:bidi="en-US"/>
+          <w14:ligatures w14:val="none"/>
+        </w:rPr>
+        <w:t xml:space="preserve">) or when the CPU load spikes for whatever reason, this can delay a frame, or even pause the rAF entirely. These risks are harder to control, but can be reduced by good computer management (not have many tabs and other programs open) and code optimisation.</w:t>
       </w:r>
       <w:r>
         <w:rPr>
@@ -4335,7 +4403,7 @@
     </w:p>
     <w:p>
       <w:pPr>
-        <w:pStyle w:val="908"/>
+        <w:pStyle w:val="912"/>
         <w:numPr>
           <w:ilvl w:val="0"/>
           <w:numId w:val="4"/>
@@ -4368,7 +4436,14 @@
           <w:highlight w:val="none"/>
           <w:lang w:val="en-US"/>
         </w:rPr>
-        <w:t xml:space="preserve">am aware in an actual experiment this would be undesired design as it can draw the attention from the subject. This addition however, made debugging and testing much easier, as I was able to interupt a run with it. A nicer way to implement this desired interrupt option is with a keyboard button press. Could’ve, would’ve, should’ve...</w:t>
+        <w:t xml:space="preserve">am aware in an actual experiment this would be undesired design as it can draw </w:t>
+      </w:r>
+      <w:r>
+        <w:rPr>
+          <w:highlight w:val="none"/>
+          <w:lang w:val="en-US"/>
+        </w:rPr>
+        <w:t xml:space="preserve">the attention from the subject. This addition however, made debugging and testing much easier, as I was able to interupt a run with it. A nicer way to implement this desired interrupt option is with a keyboard button press. Could’ve, would’ve, should’ve...</w:t>
       </w:r>
       <w:r>
         <w:rPr>
@@ -4383,6 +4458,56 @@
     </w:p>
     <w:p>
       <w:pPr>
+        <w:pStyle w:val="912"/>
+        <w:numPr>
+          <w:ilvl w:val="0"/>
+          <w:numId w:val="4"/>
+        </w:numPr>
+        <w:pBdr/>
+        <w:spacing/>
+        <w:ind/>
+        <w:rPr>
+          <w:highlight w:val="none"/>
+        </w:rPr>
+      </w:pPr>
+      <w:r>
+        <w:rPr>
+          <w:b/>
+          <w:bCs/>
+          <w:highlight w:val="none"/>
+          <w:lang w:val="en-US"/>
+        </w:rPr>
+        <w:t xml:space="preserve">Limited unit testing.</w:t>
+      </w:r>
+      <w:r>
+        <w:rPr>
+          <w:highlight w:val="none"/>
+          <w:lang w:val="en-US"/>
+        </w:rPr>
+        <w:t xml:space="preserve"> Only the </w:t>
+      </w:r>
+      <w:r>
+        <w:rPr>
+          <w:highlight w:val="none"/>
+          <w:lang w:val="en-US"/>
+        </w:rPr>
+        <w:t xml:space="preserve">generateSequence() function in sequenceUtils.js has been unit tested</w:t>
+      </w:r>
+      <w:r>
+        <w:rPr>
+          <w:highlight w:val="none"/>
+          <w:lang w:val="en-US"/>
+        </w:rPr>
+        <w:t xml:space="preserve">. Ideally you want better test coverage. While I still wrote tests for this specific function is that once the sequence is running it is very difficult to verify if all the images are present in the sequence and are in the right order. As this is crucial for the interpretation of the results I took time to write basic tests for this function.</w:t>
+      </w:r>
+      <w:r>
+        <w:rPr>
+          <w:highlight w:val="none"/>
+        </w:rPr>
+      </w:r>
+    </w:p>
+    <w:p>
+      <w:pPr>
         <w:pBdr/>
         <w:spacing/>
         <w:ind/>
@@ -4398,8 +4523,7 @@
       </w:r>
       <w:r>
         <w:rPr>
-          <w:highlight w:val="none"/>
-          <w:lang w:val="en-US" w:bidi="en-US"/>
+          <w:lang w:val="en-US"/>
         </w:rPr>
       </w:r>
       <w:r>
@@ -4410,7 +4534,7 @@
     </w:p>
     <w:p>
       <w:pPr>
-        <w:pStyle w:val="845"/>
+        <w:pStyle w:val="849"/>
         <w:pBdr/>
         <w:spacing/>
         <w:ind/>
@@ -4457,10 +4581,15 @@
           <w:lang w:val="en-US"/>
         </w:rPr>
       </w:r>
+      <w:r>
+        <w:rPr>
+          <w:lang w:val="en-US"/>
+        </w:rPr>
+      </w:r>
     </w:p>
     <w:p>
       <w:pPr>
-        <w:pStyle w:val="908"/>
+        <w:pStyle w:val="912"/>
         <w:numPr>
           <w:ilvl w:val="0"/>
           <w:numId w:val="11"/>
@@ -4499,7 +4628,7 @@
     </w:p>
     <w:p>
       <w:pPr>
-        <w:pStyle w:val="908"/>
+        <w:pStyle w:val="912"/>
         <w:numPr>
           <w:ilvl w:val="0"/>
           <w:numId w:val="11"/>
@@ -4525,7 +4654,11 @@
         </w:rPr>
         <w:t xml:space="preserve">: a combination of stackoverflow and LLM’s is usuallys sufficient ot solve most bugs, or to obtain generic (function) templates, for e.g. csv exporters that can then be adapted to need.</w:t>
       </w:r>
-      <w:r/>
+      <w:r>
+        <w:rPr>
+          <w:lang w:val="en-US"/>
+        </w:rPr>
+      </w:r>
       <w:r>
         <w:rPr>
           <w:lang w:val="en-US"/>
@@ -4534,7 +4667,7 @@
     </w:p>
     <w:p>
       <w:pPr>
-        <w:pStyle w:val="908"/>
+        <w:pStyle w:val="912"/>
         <w:numPr>
           <w:ilvl w:val="0"/>
           <w:numId w:val="11"/>
@@ -4567,10 +4700,15 @@
           <w:lang w:val="en-US"/>
         </w:rPr>
       </w:r>
+      <w:r>
+        <w:rPr>
+          <w:lang w:val="en-US"/>
+        </w:rPr>
+      </w:r>
     </w:p>
     <w:p>
       <w:pPr>
-        <w:pStyle w:val="908"/>
+        <w:pStyle w:val="912"/>
         <w:numPr>
           <w:ilvl w:val="0"/>
           <w:numId w:val="11"/>
@@ -4614,28 +4752,6 @@
         <w:rPr>
           <w:b/>
           <w:bCs/>
-          <w:highlight w:val="none"/>
-          <w:lang w:val="en-US" w:bidi="en-US"/>
-        </w:rPr>
-      </w:r>
-      <w:r>
-        <w:rPr>
-          <w:b/>
-          <w:bCs/>
-          <w:highlight w:val="none"/>
-          <w:lang w:val="en-US" w:bidi="en-US"/>
-        </w:rPr>
-      </w:r>
-      <w:r>
-        <w:rPr>
-          <w:highlight w:val="none"/>
-          <w:lang w:val="en-US" w:bidi="en-US"/>
-        </w:rPr>
-      </w:r>
-      <w:r>
-        <w:rPr>
-          <w:highlight w:val="none"/>
-          <w:lang w:val="en-US" w:bidi="en-US"/>
         </w:rPr>
       </w:r>
       <w:r>
@@ -6534,9 +6650,9 @@
     <w:lsdException w:name="Bibliography" w:uiPriority="37"/>
     <w:lsdException w:name="TOC Heading" w:uiPriority="39" w:qFormat="1"/>
   </w:latentStyles>
-  <w:style w:type="table" w:styleId="719">
+  <w:style w:type="table" w:styleId="723">
     <w:name w:val="Table Grid"/>
-    <w:basedOn w:val="905"/>
+    <w:basedOn w:val="909"/>
     <w:uiPriority w:val="59"/>
     <w:pPr>
       <w:pBdr/>
@@ -6733,9 +6849,9 @@
       </w:tcPr>
     </w:tblStylePr>
   </w:style>
-  <w:style w:type="table" w:styleId="720">
+  <w:style w:type="table" w:styleId="724">
     <w:name w:val="Table Grid Light"/>
-    <w:basedOn w:val="905"/>
+    <w:basedOn w:val="909"/>
     <w:uiPriority w:val="59"/>
     <w:pPr>
       <w:pBdr/>
@@ -6932,9 +7048,9 @@
       </w:tcPr>
     </w:tblStylePr>
   </w:style>
-  <w:style w:type="table" w:styleId="721">
+  <w:style w:type="table" w:styleId="725">
     <w:name w:val="Plain Table 1"/>
-    <w:basedOn w:val="905"/>
+    <w:basedOn w:val="909"/>
     <w:uiPriority w:val="59"/>
     <w:pPr>
       <w:pBdr/>
@@ -7157,9 +7273,9 @@
       </w:tcPr>
     </w:tblStylePr>
   </w:style>
-  <w:style w:type="table" w:styleId="722">
+  <w:style w:type="table" w:styleId="726">
     <w:name w:val="Plain Table 2"/>
-    <w:basedOn w:val="905"/>
+    <w:basedOn w:val="909"/>
     <w:uiPriority w:val="59"/>
     <w:pPr>
       <w:pBdr/>
@@ -7390,9 +7506,9 @@
       </w:tcPr>
     </w:tblStylePr>
   </w:style>
-  <w:style w:type="table" w:styleId="723">
+  <w:style w:type="table" w:styleId="727">
     <w:name w:val="Plain Table 3"/>
-    <w:basedOn w:val="905"/>
+    <w:basedOn w:val="909"/>
     <w:uiPriority w:val="99"/>
     <w:pPr>
       <w:pBdr/>
@@ -7620,9 +7736,9 @@
       </w:tcPr>
     </w:tblStylePr>
   </w:style>
-  <w:style w:type="table" w:styleId="724">
+  <w:style w:type="table" w:styleId="728">
     <w:name w:val="Plain Table 4"/>
-    <w:basedOn w:val="905"/>
+    <w:basedOn w:val="909"/>
     <w:uiPriority w:val="99"/>
     <w:pPr>
       <w:pBdr/>
@@ -7836,9 +7952,9 @@
       </w:tcPr>
     </w:tblStylePr>
   </w:style>
-  <w:style w:type="table" w:styleId="725">
+  <w:style w:type="table" w:styleId="729">
     <w:name w:val="Plain Table 5"/>
-    <w:basedOn w:val="905"/>
+    <w:basedOn w:val="909"/>
     <w:uiPriority w:val="99"/>
     <w:pPr>
       <w:pBdr/>
@@ -8069,9 +8185,9 @@
       </w:tcPr>
     </w:tblStylePr>
   </w:style>
-  <w:style w:type="table" w:styleId="726">
+  <w:style w:type="table" w:styleId="730">
     <w:name w:val="Grid Table 1 Light"/>
-    <w:basedOn w:val="905"/>
+    <w:basedOn w:val="909"/>
     <w:uiPriority w:val="99"/>
     <w:pPr>
       <w:pBdr/>
@@ -8292,9 +8408,9 @@
       </w:tcPr>
     </w:tblStylePr>
   </w:style>
-  <w:style w:type="table" w:styleId="727">
+  <w:style w:type="table" w:styleId="731">
     <w:name w:val="Grid Table 1 Light - Accent 1"/>
-    <w:basedOn w:val="905"/>
+    <w:basedOn w:val="909"/>
     <w:uiPriority w:val="99"/>
     <w:pPr>
       <w:pBdr/>
@@ -8515,9 +8631,9 @@
       </w:tcPr>
     </w:tblStylePr>
   </w:style>
-  <w:style w:type="table" w:styleId="728">
+  <w:style w:type="table" w:styleId="732">
     <w:name w:val="Grid Table 1 Light - Accent 2"/>
-    <w:basedOn w:val="905"/>
+    <w:basedOn w:val="909"/>
     <w:uiPriority w:val="99"/>
     <w:pPr>
       <w:pBdr/>
@@ -8738,9 +8854,9 @@
       </w:tcPr>
     </w:tblStylePr>
   </w:style>
-  <w:style w:type="table" w:styleId="729">
+  <w:style w:type="table" w:styleId="733">
     <w:name w:val="Grid Table 1 Light - Accent 3"/>
-    <w:basedOn w:val="905"/>
+    <w:basedOn w:val="909"/>
     <w:uiPriority w:val="99"/>
     <w:pPr>
       <w:pBdr/>
@@ -8961,9 +9077,9 @@
       </w:tcPr>
     </w:tblStylePr>
   </w:style>
-  <w:style w:type="table" w:styleId="730">
+  <w:style w:type="table" w:styleId="734">
     <w:name w:val="Grid Table 1 Light - Accent 4"/>
-    <w:basedOn w:val="905"/>
+    <w:basedOn w:val="909"/>
     <w:uiPriority w:val="99"/>
     <w:pPr>
       <w:pBdr/>
@@ -9184,9 +9300,9 @@
       </w:tcPr>
     </w:tblStylePr>
   </w:style>
-  <w:style w:type="table" w:styleId="731">
+  <w:style w:type="table" w:styleId="735">
     <w:name w:val="Grid Table 1 Light - Accent 5"/>
-    <w:basedOn w:val="905"/>
+    <w:basedOn w:val="909"/>
     <w:uiPriority w:val="99"/>
     <w:pPr>
       <w:pBdr/>
@@ -9407,9 +9523,9 @@
       </w:tcPr>
     </w:tblStylePr>
   </w:style>
-  <w:style w:type="table" w:styleId="732">
+  <w:style w:type="table" w:styleId="736">
     <w:name w:val="Grid Table 1 Light - Accent 6"/>
-    <w:basedOn w:val="905"/>
+    <w:basedOn w:val="909"/>
     <w:uiPriority w:val="99"/>
     <w:pPr>
       <w:pBdr/>
@@ -9630,9 +9746,9 @@
       </w:tcPr>
     </w:tblStylePr>
   </w:style>
-  <w:style w:type="table" w:styleId="733">
+  <w:style w:type="table" w:styleId="737">
     <w:name w:val="Grid Table 2"/>
-    <w:basedOn w:val="905"/>
+    <w:basedOn w:val="909"/>
     <w:uiPriority w:val="99"/>
     <w:pPr>
       <w:pBdr/>
@@ -9862,9 +9978,9 @@
       </w:tcPr>
     </w:tblStylePr>
   </w:style>
-  <w:style w:type="table" w:styleId="734">
+  <w:style w:type="table" w:styleId="738">
     <w:name w:val="Grid Table 2 - Accent 1"/>
-    <w:basedOn w:val="905"/>
+    <w:basedOn w:val="909"/>
     <w:uiPriority w:val="99"/>
     <w:pPr>
       <w:pBdr/>
@@ -10094,9 +10210,9 @@
       </w:tcPr>
     </w:tblStylePr>
   </w:style>
-  <w:style w:type="table" w:styleId="735">
+  <w:style w:type="table" w:styleId="739">
     <w:name w:val="Grid Table 2 - Accent 2"/>
-    <w:basedOn w:val="905"/>
+    <w:basedOn w:val="909"/>
     <w:uiPriority w:val="99"/>
     <w:pPr>
       <w:pBdr/>
@@ -10326,9 +10442,9 @@
       </w:tcPr>
     </w:tblStylePr>
   </w:style>
-  <w:style w:type="table" w:styleId="736">
+  <w:style w:type="table" w:styleId="740">
     <w:name w:val="Grid Table 2 - Accent 3"/>
-    <w:basedOn w:val="905"/>
+    <w:basedOn w:val="909"/>
     <w:uiPriority w:val="99"/>
     <w:pPr>
       <w:pBdr/>
@@ -10558,9 +10674,9 @@
       </w:tcPr>
     </w:tblStylePr>
   </w:style>
-  <w:style w:type="table" w:styleId="737">
+  <w:style w:type="table" w:styleId="741">
     <w:name w:val="Grid Table 2 - Accent 4"/>
-    <w:basedOn w:val="905"/>
+    <w:basedOn w:val="909"/>
     <w:uiPriority w:val="99"/>
     <w:pPr>
       <w:pBdr/>
@@ -10790,9 +10906,9 @@
       </w:tcPr>
     </w:tblStylePr>
   </w:style>
-  <w:style w:type="table" w:styleId="738">
+  <w:style w:type="table" w:styleId="742">
     <w:name w:val="Grid Table 2 - Accent 5"/>
-    <w:basedOn w:val="905"/>
+    <w:basedOn w:val="909"/>
     <w:uiPriority w:val="99"/>
     <w:pPr>
       <w:pBdr/>
@@ -11022,9 +11138,9 @@
       </w:tcPr>
     </w:tblStylePr>
   </w:style>
-  <w:style w:type="table" w:styleId="739">
+  <w:style w:type="table" w:styleId="743">
     <w:name w:val="Grid Table 2 - Accent 6"/>
-    <w:basedOn w:val="905"/>
+    <w:basedOn w:val="909"/>
     <w:uiPriority w:val="99"/>
     <w:pPr>
       <w:pBdr/>
@@ -11254,9 +11370,9 @@
       </w:tcPr>
     </w:tblStylePr>
   </w:style>
-  <w:style w:type="table" w:styleId="740">
+  <w:style w:type="table" w:styleId="744">
     <w:name w:val="Grid Table 3"/>
-    <w:basedOn w:val="905"/>
+    <w:basedOn w:val="909"/>
     <w:uiPriority w:val="99"/>
     <w:pPr>
       <w:pBdr/>
@@ -11499,9 +11615,9 @@
       </w:tcPr>
     </w:tblStylePr>
   </w:style>
-  <w:style w:type="table" w:styleId="741">
+  <w:style w:type="table" w:styleId="745">
     <w:name w:val="Grid Table 3 - Accent 1"/>
-    <w:basedOn w:val="905"/>
+    <w:basedOn w:val="909"/>
     <w:uiPriority w:val="99"/>
     <w:pPr>
       <w:pBdr/>
@@ -11744,9 +11860,9 @@
       </w:tcPr>
     </w:tblStylePr>
   </w:style>
-  <w:style w:type="table" w:styleId="742">
+  <w:style w:type="table" w:styleId="746">
     <w:name w:val="Grid Table 3 - Accent 2"/>
-    <w:basedOn w:val="905"/>
+    <w:basedOn w:val="909"/>
     <w:uiPriority w:val="99"/>
     <w:pPr>
       <w:pBdr/>
@@ -11989,9 +12105,9 @@
       </w:tcPr>
     </w:tblStylePr>
   </w:style>
-  <w:style w:type="table" w:styleId="743">
+  <w:style w:type="table" w:styleId="747">
     <w:name w:val="Grid Table 3 - Accent 3"/>
-    <w:basedOn w:val="905"/>
+    <w:basedOn w:val="909"/>
     <w:uiPriority w:val="99"/>
     <w:pPr>
       <w:pBdr/>
@@ -12234,9 +12350,9 @@
       </w:tcPr>
     </w:tblStylePr>
   </w:style>
-  <w:style w:type="table" w:styleId="744">
+  <w:style w:type="table" w:styleId="748">
     <w:name w:val="Grid Table 3 - Accent 4"/>
-    <w:basedOn w:val="905"/>
+    <w:basedOn w:val="909"/>
     <w:uiPriority w:val="99"/>
     <w:pPr>
       <w:pBdr/>
@@ -12479,9 +12595,9 @@
       </w:tcPr>
     </w:tblStylePr>
   </w:style>
-  <w:style w:type="table" w:styleId="745">
+  <w:style w:type="table" w:styleId="749">
     <w:name w:val="Grid Table 3 - Accent 5"/>
-    <w:basedOn w:val="905"/>
+    <w:basedOn w:val="909"/>
     <w:uiPriority w:val="99"/>
     <w:pPr>
       <w:pBdr/>
@@ -12724,9 +12840,9 @@
       </w:tcPr>
     </w:tblStylePr>
   </w:style>
-  <w:style w:type="table" w:styleId="746">
+  <w:style w:type="table" w:styleId="750">
     <w:name w:val="Grid Table 3 - Accent 6"/>
-    <w:basedOn w:val="905"/>
+    <w:basedOn w:val="909"/>
     <w:uiPriority w:val="99"/>
     <w:pPr>
       <w:pBdr/>
@@ -12969,9 +13085,9 @@
       </w:tcPr>
     </w:tblStylePr>
   </w:style>
-  <w:style w:type="table" w:styleId="747">
+  <w:style w:type="table" w:styleId="751">
     <w:name w:val="Grid Table 4"/>
-    <w:basedOn w:val="905"/>
+    <w:basedOn w:val="909"/>
     <w:uiPriority w:val="59"/>
     <w:pPr>
       <w:pBdr/>
@@ -13202,9 +13318,9 @@
       </w:tcPr>
     </w:tblStylePr>
   </w:style>
-  <w:style w:type="table" w:styleId="748">
+  <w:style w:type="table" w:styleId="752">
     <w:name w:val="Grid Table 4 - Accent 1"/>
-    <w:basedOn w:val="905"/>
+    <w:basedOn w:val="909"/>
     <w:uiPriority w:val="59"/>
     <w:pPr>
       <w:pBdr/>
@@ -13435,9 +13551,9 @@
       </w:tcPr>
     </w:tblStylePr>
   </w:style>
-  <w:style w:type="table" w:styleId="749">
+  <w:style w:type="table" w:styleId="753">
     <w:name w:val="Grid Table 4 - Accent 2"/>
-    <w:basedOn w:val="905"/>
+    <w:basedOn w:val="909"/>
     <w:uiPriority w:val="59"/>
     <w:pPr>
       <w:pBdr/>
@@ -13668,9 +13784,9 @@
       </w:tcPr>
     </w:tblStylePr>
   </w:style>
-  <w:style w:type="table" w:styleId="750">
+  <w:style w:type="table" w:styleId="754">
     <w:name w:val="Grid Table 4 - Accent 3"/>
-    <w:basedOn w:val="905"/>
+    <w:basedOn w:val="909"/>
     <w:uiPriority w:val="59"/>
     <w:pPr>
       <w:pBdr/>
@@ -13901,9 +14017,9 @@
       </w:tcPr>
     </w:tblStylePr>
   </w:style>
-  <w:style w:type="table" w:styleId="751">
+  <w:style w:type="table" w:styleId="755">
     <w:name w:val="Grid Table 4 - Accent 4"/>
-    <w:basedOn w:val="905"/>
+    <w:basedOn w:val="909"/>
     <w:uiPriority w:val="59"/>
     <w:pPr>
       <w:pBdr/>
@@ -14134,9 +14250,9 @@
       </w:tcPr>
     </w:tblStylePr>
   </w:style>
-  <w:style w:type="table" w:styleId="752">
+  <w:style w:type="table" w:styleId="756">
     <w:name w:val="Grid Table 4 - Accent 5"/>
-    <w:basedOn w:val="905"/>
+    <w:basedOn w:val="909"/>
     <w:uiPriority w:val="59"/>
     <w:pPr>
       <w:pBdr/>
@@ -14367,9 +14483,9 @@
       </w:tcPr>
     </w:tblStylePr>
   </w:style>
-  <w:style w:type="table" w:styleId="753">
+  <w:style w:type="table" w:styleId="757">
     <w:name w:val="Grid Table 4 - Accent 6"/>
-    <w:basedOn w:val="905"/>
+    <w:basedOn w:val="909"/>
     <w:uiPriority w:val="59"/>
     <w:pPr>
       <w:pBdr/>
@@ -14600,9 +14716,9 @@
       </w:tcPr>
     </w:tblStylePr>
   </w:style>
-  <w:style w:type="table" w:styleId="754">
+  <w:style w:type="table" w:styleId="758">
     <w:name w:val="Grid Table 5 Dark"/>
-    <w:basedOn w:val="905"/>
+    <w:basedOn w:val="909"/>
     <w:uiPriority w:val="99"/>
     <w:pPr>
       <w:pBdr/>
@@ -14828,9 +14944,9 @@
       </w:tcPr>
     </w:tblStylePr>
   </w:style>
-  <w:style w:type="table" w:styleId="755">
+  <w:style w:type="table" w:styleId="759">
     <w:name w:val="Grid Table 5 Dark- Accent 1"/>
-    <w:basedOn w:val="905"/>
+    <w:basedOn w:val="909"/>
     <w:uiPriority w:val="99"/>
     <w:pPr>
       <w:pBdr/>
@@ -15056,9 +15172,9 @@
       </w:tcPr>
     </w:tblStylePr>
   </w:style>
-  <w:style w:type="table" w:styleId="756">
+  <w:style w:type="table" w:styleId="760">
     <w:name w:val="Grid Table 5 Dark - Accent 2"/>
-    <w:basedOn w:val="905"/>
+    <w:basedOn w:val="909"/>
     <w:uiPriority w:val="99"/>
     <w:pPr>
       <w:pBdr/>
@@ -15284,9 +15400,9 @@
       </w:tcPr>
     </w:tblStylePr>
   </w:style>
-  <w:style w:type="table" w:styleId="757">
+  <w:style w:type="table" w:styleId="761">
     <w:name w:val="Grid Table 5 Dark - Accent 3"/>
-    <w:basedOn w:val="905"/>
+    <w:basedOn w:val="909"/>
     <w:uiPriority w:val="99"/>
     <w:pPr>
       <w:pBdr/>
@@ -15512,9 +15628,9 @@
       </w:tcPr>
     </w:tblStylePr>
   </w:style>
-  <w:style w:type="table" w:styleId="758">
+  <w:style w:type="table" w:styleId="762">
     <w:name w:val="Grid Table 5 Dark- Accent 4"/>
-    <w:basedOn w:val="905"/>
+    <w:basedOn w:val="909"/>
     <w:uiPriority w:val="99"/>
     <w:pPr>
       <w:pBdr/>
@@ -15740,9 +15856,9 @@
       </w:tcPr>
     </w:tblStylePr>
   </w:style>
-  <w:style w:type="table" w:styleId="759">
+  <w:style w:type="table" w:styleId="763">
     <w:name w:val="Grid Table 5 Dark - Accent 5"/>
-    <w:basedOn w:val="905"/>
+    <w:basedOn w:val="909"/>
     <w:uiPriority w:val="99"/>
     <w:pPr>
       <w:pBdr/>
@@ -15968,9 +16084,9 @@
       </w:tcPr>
     </w:tblStylePr>
   </w:style>
-  <w:style w:type="table" w:styleId="760">
+  <w:style w:type="table" w:styleId="764">
     <w:name w:val="Grid Table 5 Dark - Accent 6"/>
-    <w:basedOn w:val="905"/>
+    <w:basedOn w:val="909"/>
     <w:uiPriority w:val="99"/>
     <w:pPr>
       <w:pBdr/>
@@ -16196,9 +16312,9 @@
       </w:tcPr>
     </w:tblStylePr>
   </w:style>
-  <w:style w:type="table" w:styleId="761">
+  <w:style w:type="table" w:styleId="765">
     <w:name w:val="Grid Table 6 Colorful"/>
-    <w:basedOn w:val="905"/>
+    <w:basedOn w:val="909"/>
     <w:uiPriority w:val="99"/>
     <w:pPr>
       <w:pBdr/>
@@ -16426,9 +16542,9 @@
       </w:tcPr>
     </w:tblStylePr>
   </w:style>
-  <w:style w:type="table" w:styleId="762">
+  <w:style w:type="table" w:styleId="766">
     <w:name w:val="Grid Table 6 Colorful - Accent 1"/>
-    <w:basedOn w:val="905"/>
+    <w:basedOn w:val="909"/>
     <w:uiPriority w:val="99"/>
     <w:pPr>
       <w:pBdr/>
@@ -16656,9 +16772,9 @@
       </w:tcPr>
     </w:tblStylePr>
   </w:style>
-  <w:style w:type="table" w:styleId="763">
+  <w:style w:type="table" w:styleId="767">
     <w:name w:val="Grid Table 6 Colorful - Accent 2"/>
-    <w:basedOn w:val="905"/>
+    <w:basedOn w:val="909"/>
     <w:uiPriority w:val="99"/>
     <w:pPr>
       <w:pBdr/>
@@ -16886,9 +17002,9 @@
       </w:tcPr>
     </w:tblStylePr>
   </w:style>
-  <w:style w:type="table" w:styleId="764">
+  <w:style w:type="table" w:styleId="768">
     <w:name w:val="Grid Table 6 Colorful - Accent 3"/>
-    <w:basedOn w:val="905"/>
+    <w:basedOn w:val="909"/>
     <w:uiPriority w:val="99"/>
     <w:pPr>
       <w:pBdr/>
@@ -17116,9 +17232,9 @@
       </w:tcPr>
     </w:tblStylePr>
   </w:style>
-  <w:style w:type="table" w:styleId="765">
+  <w:style w:type="table" w:styleId="769">
     <w:name w:val="Grid Table 6 Colorful - Accent 4"/>
-    <w:basedOn w:val="905"/>
+    <w:basedOn w:val="909"/>
     <w:uiPriority w:val="99"/>
     <w:pPr>
       <w:pBdr/>
@@ -17346,9 +17462,9 @@
       </w:tcPr>
     </w:tblStylePr>
   </w:style>
-  <w:style w:type="table" w:styleId="766">
+  <w:style w:type="table" w:styleId="770">
     <w:name w:val="Grid Table 6 Colorful - Accent 5"/>
-    <w:basedOn w:val="905"/>
+    <w:basedOn w:val="909"/>
     <w:uiPriority w:val="99"/>
     <w:pPr>
       <w:pBdr/>
@@ -17576,9 +17692,9 @@
       </w:tcPr>
     </w:tblStylePr>
   </w:style>
-  <w:style w:type="table" w:styleId="767">
+  <w:style w:type="table" w:styleId="771">
     <w:name w:val="Grid Table 6 Colorful - Accent 6"/>
-    <w:basedOn w:val="905"/>
+    <w:basedOn w:val="909"/>
     <w:uiPriority w:val="99"/>
     <w:pPr>
       <w:pBdr/>
@@ -17806,9 +17922,9 @@
       </w:tcPr>
     </w:tblStylePr>
   </w:style>
-  <w:style w:type="table" w:styleId="768">
+  <w:style w:type="table" w:styleId="772">
     <w:name w:val="Grid Table 7 Colorful"/>
-    <w:basedOn w:val="905"/>
+    <w:basedOn w:val="909"/>
     <w:uiPriority w:val="99"/>
     <w:pPr>
       <w:pBdr/>
@@ -18060,9 +18176,9 @@
       </w:tcPr>
     </w:tblStylePr>
   </w:style>
-  <w:style w:type="table" w:styleId="769">
+  <w:style w:type="table" w:styleId="773">
     <w:name w:val="Grid Table 7 Colorful - Accent 1"/>
-    <w:basedOn w:val="905"/>
+    <w:basedOn w:val="909"/>
     <w:uiPriority w:val="99"/>
     <w:pPr>
       <w:pBdr/>
@@ -18314,9 +18430,9 @@
       </w:tcPr>
     </w:tblStylePr>
   </w:style>
-  <w:style w:type="table" w:styleId="770">
+  <w:style w:type="table" w:styleId="774">
     <w:name w:val="Grid Table 7 Colorful - Accent 2"/>
-    <w:basedOn w:val="905"/>
+    <w:basedOn w:val="909"/>
     <w:uiPriority w:val="99"/>
     <w:pPr>
       <w:pBdr/>
@@ -18568,9 +18684,9 @@
       </w:tcPr>
     </w:tblStylePr>
   </w:style>
-  <w:style w:type="table" w:styleId="771">
+  <w:style w:type="table" w:styleId="775">
     <w:name w:val="Grid Table 7 Colorful - Accent 3"/>
-    <w:basedOn w:val="905"/>
+    <w:basedOn w:val="909"/>
     <w:uiPriority w:val="99"/>
     <w:pPr>
       <w:pBdr/>
@@ -18822,9 +18938,9 @@
       </w:tcPr>
     </w:tblStylePr>
   </w:style>
-  <w:style w:type="table" w:styleId="772">
+  <w:style w:type="table" w:styleId="776">
     <w:name w:val="Grid Table 7 Colorful - Accent 4"/>
-    <w:basedOn w:val="905"/>
+    <w:basedOn w:val="909"/>
     <w:uiPriority w:val="99"/>
     <w:pPr>
       <w:pBdr/>
@@ -19076,9 +19192,9 @@
       </w:tcPr>
     </w:tblStylePr>
   </w:style>
-  <w:style w:type="table" w:styleId="773">
+  <w:style w:type="table" w:styleId="777">
     <w:name w:val="Grid Table 7 Colorful - Accent 5"/>
-    <w:basedOn w:val="905"/>
+    <w:basedOn w:val="909"/>
     <w:uiPriority w:val="99"/>
     <w:pPr>
       <w:pBdr/>
@@ -19330,9 +19446,9 @@
       </w:tcPr>
     </w:tblStylePr>
   </w:style>
-  <w:style w:type="table" w:styleId="774">
+  <w:style w:type="table" w:styleId="778">
     <w:name w:val="Grid Table 7 Colorful - Accent 6"/>
-    <w:basedOn w:val="905"/>
+    <w:basedOn w:val="909"/>
     <w:uiPriority w:val="99"/>
     <w:pPr>
       <w:pBdr/>
@@ -19584,9 +19700,9 @@
       </w:tcPr>
     </w:tblStylePr>
   </w:style>
-  <w:style w:type="table" w:styleId="775">
+  <w:style w:type="table" w:styleId="779">
     <w:name w:val="List Table 1 Light"/>
-    <w:basedOn w:val="905"/>
+    <w:basedOn w:val="909"/>
     <w:uiPriority w:val="99"/>
     <w:pPr>
       <w:pBdr/>
@@ -19800,9 +19916,9 @@
       </w:tcPr>
     </w:tblStylePr>
   </w:style>
-  <w:style w:type="table" w:styleId="776">
+  <w:style w:type="table" w:styleId="780">
     <w:name w:val="List Table 1 Light - Accent 1"/>
-    <w:basedOn w:val="905"/>
+    <w:basedOn w:val="909"/>
     <w:uiPriority w:val="99"/>
     <w:pPr>
       <w:pBdr/>
@@ -20016,9 +20132,9 @@
       </w:tcPr>
     </w:tblStylePr>
   </w:style>
-  <w:style w:type="table" w:styleId="777">
+  <w:style w:type="table" w:styleId="781">
     <w:name w:val="List Table 1 Light - Accent 2"/>
-    <w:basedOn w:val="905"/>
+    <w:basedOn w:val="909"/>
     <w:uiPriority w:val="99"/>
     <w:pPr>
       <w:pBdr/>
@@ -20232,9 +20348,9 @@
       </w:tcPr>
     </w:tblStylePr>
   </w:style>
-  <w:style w:type="table" w:styleId="778">
+  <w:style w:type="table" w:styleId="782">
     <w:name w:val="List Table 1 Light - Accent 3"/>
-    <w:basedOn w:val="905"/>
+    <w:basedOn w:val="909"/>
     <w:uiPriority w:val="99"/>
     <w:pPr>
       <w:pBdr/>
@@ -20448,9 +20564,9 @@
       </w:tcPr>
     </w:tblStylePr>
   </w:style>
-  <w:style w:type="table" w:styleId="779">
+  <w:style w:type="table" w:styleId="783">
     <w:name w:val="List Table 1 Light - Accent 4"/>
-    <w:basedOn w:val="905"/>
+    <w:basedOn w:val="909"/>
     <w:uiPriority w:val="99"/>
     <w:pPr>
       <w:pBdr/>
@@ -20664,9 +20780,9 @@
       </w:tcPr>
     </w:tblStylePr>
   </w:style>
-  <w:style w:type="table" w:styleId="780">
+  <w:style w:type="table" w:styleId="784">
     <w:name w:val="List Table 1 Light - Accent 5"/>
-    <w:basedOn w:val="905"/>
+    <w:basedOn w:val="909"/>
     <w:uiPriority w:val="99"/>
     <w:pPr>
       <w:pBdr/>
@@ -20880,9 +20996,9 @@
       </w:tcPr>
     </w:tblStylePr>
   </w:style>
-  <w:style w:type="table" w:styleId="781">
+  <w:style w:type="table" w:styleId="785">
     <w:name w:val="List Table 1 Light - Accent 6"/>
-    <w:basedOn w:val="905"/>
+    <w:basedOn w:val="909"/>
     <w:uiPriority w:val="99"/>
     <w:pPr>
       <w:pBdr/>
@@ -21096,9 +21212,9 @@
       </w:tcPr>
     </w:tblStylePr>
   </w:style>
-  <w:style w:type="table" w:styleId="782">
+  <w:style w:type="table" w:styleId="786">
     <w:name w:val="List Table 2"/>
-    <w:basedOn w:val="905"/>
+    <w:basedOn w:val="909"/>
     <w:uiPriority w:val="99"/>
     <w:pPr>
       <w:pBdr/>
@@ -21334,9 +21450,9 @@
       </w:tcPr>
     </w:tblStylePr>
   </w:style>
-  <w:style w:type="table" w:styleId="783">
+  <w:style w:type="table" w:styleId="787">
     <w:name w:val="List Table 2 - Accent 1"/>
-    <w:basedOn w:val="905"/>
+    <w:basedOn w:val="909"/>
     <w:uiPriority w:val="99"/>
     <w:pPr>
       <w:pBdr/>
@@ -21572,9 +21688,9 @@
       </w:tcPr>
     </w:tblStylePr>
   </w:style>
-  <w:style w:type="table" w:styleId="784">
+  <w:style w:type="table" w:styleId="788">
     <w:name w:val="List Table 2 - Accent 2"/>
-    <w:basedOn w:val="905"/>
+    <w:basedOn w:val="909"/>
     <w:uiPriority w:val="99"/>
     <w:pPr>
       <w:pBdr/>
@@ -21810,9 +21926,9 @@
       </w:tcPr>
     </w:tblStylePr>
   </w:style>
-  <w:style w:type="table" w:styleId="785">
+  <w:style w:type="table" w:styleId="789">
     <w:name w:val="List Table 2 - Accent 3"/>
-    <w:basedOn w:val="905"/>
+    <w:basedOn w:val="909"/>
     <w:uiPriority w:val="99"/>
     <w:pPr>
       <w:pBdr/>
@@ -22048,9 +22164,9 @@
       </w:tcPr>
     </w:tblStylePr>
   </w:style>
-  <w:style w:type="table" w:styleId="786">
+  <w:style w:type="table" w:styleId="790">
     <w:name w:val="List Table 2 - Accent 4"/>
-    <w:basedOn w:val="905"/>
+    <w:basedOn w:val="909"/>
     <w:uiPriority w:val="99"/>
     <w:pPr>
       <w:pBdr/>
@@ -22286,9 +22402,9 @@
       </w:tcPr>
     </w:tblStylePr>
   </w:style>
-  <w:style w:type="table" w:styleId="787">
+  <w:style w:type="table" w:styleId="791">
     <w:name w:val="List Table 2 - Accent 5"/>
-    <w:basedOn w:val="905"/>
+    <w:basedOn w:val="909"/>
     <w:uiPriority w:val="99"/>
     <w:pPr>
       <w:pBdr/>
@@ -22524,9 +22640,9 @@
       </w:tcPr>
     </w:tblStylePr>
   </w:style>
-  <w:style w:type="table" w:styleId="788">
+  <w:style w:type="table" w:styleId="792">
     <w:name w:val="List Table 2 - Accent 6"/>
-    <w:basedOn w:val="905"/>
+    <w:basedOn w:val="909"/>
     <w:uiPriority w:val="99"/>
     <w:pPr>
       <w:pBdr/>
@@ -22762,9 +22878,9 @@
       </w:tcPr>
     </w:tblStylePr>
   </w:style>
-  <w:style w:type="table" w:styleId="789">
+  <w:style w:type="table" w:styleId="793">
     <w:name w:val="List Table 3"/>
-    <w:basedOn w:val="905"/>
+    <w:basedOn w:val="909"/>
     <w:uiPriority w:val="99"/>
     <w:pPr>
       <w:pBdr/>
@@ -22990,9 +23106,9 @@
       </w:tcPr>
     </w:tblStylePr>
   </w:style>
-  <w:style w:type="table" w:styleId="790">
+  <w:style w:type="table" w:styleId="794">
     <w:name w:val="List Table 3 - Accent 1"/>
-    <w:basedOn w:val="905"/>
+    <w:basedOn w:val="909"/>
     <w:uiPriority w:val="99"/>
     <w:pPr>
       <w:pBdr/>
@@ -23218,9 +23334,9 @@
       </w:tcPr>
     </w:tblStylePr>
   </w:style>
-  <w:style w:type="table" w:styleId="791">
+  <w:style w:type="table" w:styleId="795">
     <w:name w:val="List Table 3 - Accent 2"/>
-    <w:basedOn w:val="905"/>
+    <w:basedOn w:val="909"/>
     <w:uiPriority w:val="99"/>
     <w:pPr>
       <w:pBdr/>
@@ -23446,9 +23562,9 @@
       </w:tcPr>
     </w:tblStylePr>
   </w:style>
-  <w:style w:type="table" w:styleId="792">
+  <w:style w:type="table" w:styleId="796">
     <w:name w:val="List Table 3 - Accent 3"/>
-    <w:basedOn w:val="905"/>
+    <w:basedOn w:val="909"/>
     <w:uiPriority w:val="99"/>
     <w:pPr>
       <w:pBdr/>
@@ -23674,9 +23790,9 @@
       </w:tcPr>
     </w:tblStylePr>
   </w:style>
-  <w:style w:type="table" w:styleId="793">
+  <w:style w:type="table" w:styleId="797">
     <w:name w:val="List Table 3 - Accent 4"/>
-    <w:basedOn w:val="905"/>
+    <w:basedOn w:val="909"/>
     <w:uiPriority w:val="99"/>
     <w:pPr>
       <w:pBdr/>
@@ -23902,9 +24018,9 @@
       </w:tcPr>
     </w:tblStylePr>
   </w:style>
-  <w:style w:type="table" w:styleId="794">
+  <w:style w:type="table" w:styleId="798">
     <w:name w:val="List Table 3 - Accent 5"/>
-    <w:basedOn w:val="905"/>
+    <w:basedOn w:val="909"/>
     <w:uiPriority w:val="99"/>
     <w:pPr>
       <w:pBdr/>
@@ -24130,9 +24246,9 @@
       </w:tcPr>
     </w:tblStylePr>
   </w:style>
-  <w:style w:type="table" w:styleId="795">
+  <w:style w:type="table" w:styleId="799">
     <w:name w:val="List Table 3 - Accent 6"/>
-    <w:basedOn w:val="905"/>
+    <w:basedOn w:val="909"/>
     <w:uiPriority w:val="99"/>
     <w:pPr>
       <w:pBdr/>
@@ -24358,9 +24474,9 @@
       </w:tcPr>
     </w:tblStylePr>
   </w:style>
-  <w:style w:type="table" w:styleId="796">
+  <w:style w:type="table" w:styleId="800">
     <w:name w:val="List Table 4"/>
-    <w:basedOn w:val="905"/>
+    <w:basedOn w:val="909"/>
     <w:uiPriority w:val="99"/>
     <w:pPr>
       <w:pBdr/>
@@ -24583,9 +24699,9 @@
       </w:tcPr>
     </w:tblStylePr>
   </w:style>
-  <w:style w:type="table" w:styleId="797">
+  <w:style w:type="table" w:styleId="801">
     <w:name w:val="List Table 4 - Accent 1"/>
-    <w:basedOn w:val="905"/>
+    <w:basedOn w:val="909"/>
     <w:uiPriority w:val="99"/>
     <w:pPr>
       <w:pBdr/>
@@ -24808,9 +24924,9 @@
       </w:tcPr>
     </w:tblStylePr>
   </w:style>
-  <w:style w:type="table" w:styleId="798">
+  <w:style w:type="table" w:styleId="802">
     <w:name w:val="List Table 4 - Accent 2"/>
-    <w:basedOn w:val="905"/>
+    <w:basedOn w:val="909"/>
     <w:uiPriority w:val="99"/>
     <w:pPr>
       <w:pBdr/>
@@ -25033,9 +25149,9 @@
       </w:tcPr>
     </w:tblStylePr>
   </w:style>
-  <w:style w:type="table" w:styleId="799">
+  <w:style w:type="table" w:styleId="803">
     <w:name w:val="List Table 4 - Accent 3"/>
-    <w:basedOn w:val="905"/>
+    <w:basedOn w:val="909"/>
     <w:uiPriority w:val="99"/>
     <w:pPr>
       <w:pBdr/>
@@ -25258,9 +25374,9 @@
       </w:tcPr>
     </w:tblStylePr>
   </w:style>
-  <w:style w:type="table" w:styleId="800">
+  <w:style w:type="table" w:styleId="804">
     <w:name w:val="List Table 4 - Accent 4"/>
-    <w:basedOn w:val="905"/>
+    <w:basedOn w:val="909"/>
     <w:uiPriority w:val="99"/>
     <w:pPr>
       <w:pBdr/>
@@ -25483,9 +25599,9 @@
       </w:tcPr>
     </w:tblStylePr>
   </w:style>
-  <w:style w:type="table" w:styleId="801">
+  <w:style w:type="table" w:styleId="805">
     <w:name w:val="List Table 4 - Accent 5"/>
-    <w:basedOn w:val="905"/>
+    <w:basedOn w:val="909"/>
     <w:uiPriority w:val="99"/>
     <w:pPr>
       <w:pBdr/>
@@ -25708,9 +25824,9 @@
       </w:tcPr>
     </w:tblStylePr>
   </w:style>
-  <w:style w:type="table" w:styleId="802">
+  <w:style w:type="table" w:styleId="806">
     <w:name w:val="List Table 4 - Accent 6"/>
-    <w:basedOn w:val="905"/>
+    <w:basedOn w:val="909"/>
     <w:uiPriority w:val="99"/>
     <w:pPr>
       <w:pBdr/>
@@ -25933,9 +26049,9 @@
       </w:tcPr>
     </w:tblStylePr>
   </w:style>
-  <w:style w:type="table" w:styleId="803">
+  <w:style w:type="table" w:styleId="807">
     <w:name w:val="List Table 5 Dark"/>
-    <w:basedOn w:val="905"/>
+    <w:basedOn w:val="909"/>
     <w:uiPriority w:val="99"/>
     <w:pPr>
       <w:pBdr/>
@@ -26175,9 +26291,9 @@
       </w:tcPr>
     </w:tblStylePr>
   </w:style>
-  <w:style w:type="table" w:styleId="804">
+  <w:style w:type="table" w:styleId="808">
     <w:name w:val="List Table 5 Dark - Accent 1"/>
-    <w:basedOn w:val="905"/>
+    <w:basedOn w:val="909"/>
     <w:uiPriority w:val="99"/>
     <w:pPr>
       <w:pBdr/>
@@ -26417,9 +26533,9 @@
       </w:tcPr>
     </w:tblStylePr>
   </w:style>
-  <w:style w:type="table" w:styleId="805">
+  <w:style w:type="table" w:styleId="809">
     <w:name w:val="List Table 5 Dark - Accent 2"/>
-    <w:basedOn w:val="905"/>
+    <w:basedOn w:val="909"/>
     <w:uiPriority w:val="99"/>
     <w:pPr>
       <w:pBdr/>
@@ -26659,9 +26775,9 @@
       </w:tcPr>
     </w:tblStylePr>
   </w:style>
-  <w:style w:type="table" w:styleId="806">
+  <w:style w:type="table" w:styleId="810">
     <w:name w:val="List Table 5 Dark - Accent 3"/>
-    <w:basedOn w:val="905"/>
+    <w:basedOn w:val="909"/>
     <w:uiPriority w:val="99"/>
     <w:pPr>
       <w:pBdr/>
@@ -26901,9 +27017,9 @@
       </w:tcPr>
     </w:tblStylePr>
   </w:style>
-  <w:style w:type="table" w:styleId="807">
+  <w:style w:type="table" w:styleId="811">
     <w:name w:val="List Table 5 Dark - Accent 4"/>
-    <w:basedOn w:val="905"/>
+    <w:basedOn w:val="909"/>
     <w:uiPriority w:val="99"/>
     <w:pPr>
       <w:pBdr/>
@@ -27143,9 +27259,9 @@
       </w:tcPr>
     </w:tblStylePr>
   </w:style>
-  <w:style w:type="table" w:styleId="808">
+  <w:style w:type="table" w:styleId="812">
     <w:name w:val="List Table 5 Dark - Accent 5"/>
-    <w:basedOn w:val="905"/>
+    <w:basedOn w:val="909"/>
     <w:uiPriority w:val="99"/>
     <w:pPr>
       <w:pBdr/>
@@ -27385,9 +27501,9 @@
       </w:tcPr>
     </w:tblStylePr>
   </w:style>
-  <w:style w:type="table" w:styleId="809">
+  <w:style w:type="table" w:styleId="813">
     <w:name w:val="List Table 5 Dark - Accent 6"/>
-    <w:basedOn w:val="905"/>
+    <w:basedOn w:val="909"/>
     <w:uiPriority w:val="99"/>
     <w:pPr>
       <w:pBdr/>
@@ -27627,9 +27743,9 @@
       </w:tcPr>
     </w:tblStylePr>
   </w:style>
-  <w:style w:type="table" w:styleId="810">
+  <w:style w:type="table" w:styleId="814">
     <w:name w:val="List Table 6 Colorful"/>
-    <w:basedOn w:val="905"/>
+    <w:basedOn w:val="909"/>
     <w:uiPriority w:val="99"/>
     <w:pPr>
       <w:pBdr/>
@@ -27850,9 +27966,9 @@
       </w:tcPr>
     </w:tblStylePr>
   </w:style>
-  <w:style w:type="table" w:styleId="811">
+  <w:style w:type="table" w:styleId="815">
     <w:name w:val="List Table 6 Colorful - Accent 1"/>
-    <w:basedOn w:val="905"/>
+    <w:basedOn w:val="909"/>
     <w:uiPriority w:val="99"/>
     <w:pPr>
       <w:pBdr/>
@@ -28073,9 +28189,9 @@
       </w:tcPr>
     </w:tblStylePr>
   </w:style>
-  <w:style w:type="table" w:styleId="812">
+  <w:style w:type="table" w:styleId="816">
     <w:name w:val="List Table 6 Colorful - Accent 2"/>
-    <w:basedOn w:val="905"/>
+    <w:basedOn w:val="909"/>
     <w:uiPriority w:val="99"/>
     <w:pPr>
       <w:pBdr/>
@@ -28296,9 +28412,9 @@
       </w:tcPr>
     </w:tblStylePr>
   </w:style>
-  <w:style w:type="table" w:styleId="813">
+  <w:style w:type="table" w:styleId="817">
     <w:name w:val="List Table 6 Colorful - Accent 3"/>
-    <w:basedOn w:val="905"/>
+    <w:basedOn w:val="909"/>
     <w:uiPriority w:val="99"/>
     <w:pPr>
       <w:pBdr/>
@@ -28519,9 +28635,9 @@
       </w:tcPr>
     </w:tblStylePr>
   </w:style>
-  <w:style w:type="table" w:styleId="814">
+  <w:style w:type="table" w:styleId="818">
     <w:name w:val="List Table 6 Colorful - Accent 4"/>
-    <w:basedOn w:val="905"/>
+    <w:basedOn w:val="909"/>
     <w:uiPriority w:val="99"/>
     <w:pPr>
       <w:pBdr/>
@@ -28742,9 +28858,9 @@
       </w:tcPr>
     </w:tblStylePr>
   </w:style>
-  <w:style w:type="table" w:styleId="815">
+  <w:style w:type="table" w:styleId="819">
     <w:name w:val="List Table 6 Colorful - Accent 5"/>
-    <w:basedOn w:val="905"/>
+    <w:basedOn w:val="909"/>
     <w:uiPriority w:val="99"/>
     <w:pPr>
       <w:pBdr/>
@@ -28965,9 +29081,9 @@
       </w:tcPr>
     </w:tblStylePr>
   </w:style>
-  <w:style w:type="table" w:styleId="816">
+  <w:style w:type="table" w:styleId="820">
     <w:name w:val="List Table 6 Colorful - Accent 6"/>
-    <w:basedOn w:val="905"/>
+    <w:basedOn w:val="909"/>
     <w:uiPriority w:val="99"/>
     <w:pPr>
       <w:pBdr/>
@@ -29188,9 +29304,9 @@
       </w:tcPr>
     </w:tblStylePr>
   </w:style>
-  <w:style w:type="table" w:styleId="817">
+  <w:style w:type="table" w:styleId="821">
     <w:name w:val="List Table 7 Colorful"/>
-    <w:basedOn w:val="905"/>
+    <w:basedOn w:val="909"/>
     <w:uiPriority w:val="99"/>
     <w:pPr>
       <w:pBdr/>
@@ -29444,9 +29560,9 @@
       </w:tcPr>
     </w:tblStylePr>
   </w:style>
-  <w:style w:type="table" w:styleId="818">
+  <w:style w:type="table" w:styleId="822">
     <w:name w:val="List Table 7 Colorful - Accent 1"/>
-    <w:basedOn w:val="905"/>
+    <w:basedOn w:val="909"/>
     <w:uiPriority w:val="99"/>
     <w:pPr>
       <w:pBdr/>
@@ -29700,9 +29816,9 @@
       </w:tcPr>
     </w:tblStylePr>
   </w:style>
-  <w:style w:type="table" w:styleId="819">
+  <w:style w:type="table" w:styleId="823">
     <w:name w:val="List Table 7 Colorful - Accent 2"/>
-    <w:basedOn w:val="905"/>
+    <w:basedOn w:val="909"/>
     <w:uiPriority w:val="99"/>
     <w:pPr>
       <w:pBdr/>
@@ -29956,9 +30072,9 @@
       </w:tcPr>
     </w:tblStylePr>
   </w:style>
-  <w:style w:type="table" w:styleId="820">
+  <w:style w:type="table" w:styleId="824">
     <w:name w:val="List Table 7 Colorful - Accent 3"/>
-    <w:basedOn w:val="905"/>
+    <w:basedOn w:val="909"/>
     <w:uiPriority w:val="99"/>
     <w:pPr>
       <w:pBdr/>
@@ -30212,9 +30328,9 @@
       </w:tcPr>
     </w:tblStylePr>
   </w:style>
-  <w:style w:type="table" w:styleId="821">
+  <w:style w:type="table" w:styleId="825">
     <w:name w:val="List Table 7 Colorful - Accent 4"/>
-    <w:basedOn w:val="905"/>
+    <w:basedOn w:val="909"/>
     <w:uiPriority w:val="99"/>
     <w:pPr>
       <w:pBdr/>
@@ -30468,9 +30584,9 @@
       </w:tcPr>
     </w:tblStylePr>
   </w:style>
-  <w:style w:type="table" w:styleId="822">
+  <w:style w:type="table" w:styleId="826">
     <w:name w:val="List Table 7 Colorful - Accent 5"/>
-    <w:basedOn w:val="905"/>
+    <w:basedOn w:val="909"/>
     <w:uiPriority w:val="99"/>
     <w:pPr>
       <w:pBdr/>
@@ -30724,9 +30840,9 @@
       </w:tcPr>
     </w:tblStylePr>
   </w:style>
-  <w:style w:type="table" w:styleId="823">
+  <w:style w:type="table" w:styleId="827">
     <w:name w:val="List Table 7 Colorful - Accent 6"/>
-    <w:basedOn w:val="905"/>
+    <w:basedOn w:val="909"/>
     <w:uiPriority w:val="99"/>
     <w:pPr>
       <w:pBdr/>
@@ -30980,9 +31096,9 @@
       </w:tcPr>
     </w:tblStylePr>
   </w:style>
-  <w:style w:type="table" w:styleId="824">
+  <w:style w:type="table" w:styleId="828">
     <w:name w:val="Lined - Accent"/>
-    <w:basedOn w:val="905"/>
+    <w:basedOn w:val="909"/>
     <w:uiPriority w:val="99"/>
     <w:pPr>
       <w:pBdr/>
@@ -31217,9 +31333,9 @@
       </w:tcPr>
     </w:tblStylePr>
   </w:style>
-  <w:style w:type="table" w:styleId="825">
+  <w:style w:type="table" w:styleId="829">
     <w:name w:val="Lined - Accent 1"/>
-    <w:basedOn w:val="905"/>
+    <w:basedOn w:val="909"/>
     <w:uiPriority w:val="99"/>
     <w:pPr>
       <w:pBdr/>
@@ -31454,9 +31570,9 @@
       </w:tcPr>
     </w:tblStylePr>
   </w:style>
-  <w:style w:type="table" w:styleId="826">
+  <w:style w:type="table" w:styleId="830">
     <w:name w:val="Lined - Accent 2"/>
-    <w:basedOn w:val="905"/>
+    <w:basedOn w:val="909"/>
     <w:uiPriority w:val="99"/>
     <w:pPr>
       <w:pBdr/>
@@ -31691,9 +31807,9 @@
       </w:tcPr>
     </w:tblStylePr>
   </w:style>
-  <w:style w:type="table" w:styleId="827">
+  <w:style w:type="table" w:styleId="831">
     <w:name w:val="Lined - Accent 3"/>
-    <w:basedOn w:val="905"/>
+    <w:basedOn w:val="909"/>
     <w:uiPriority w:val="99"/>
     <w:pPr>
       <w:pBdr/>
@@ -31928,9 +32044,9 @@
       </w:tcPr>
     </w:tblStylePr>
   </w:style>
-  <w:style w:type="table" w:styleId="828">
+  <w:style w:type="table" w:styleId="832">
     <w:name w:val="Lined - Accent 4"/>
-    <w:basedOn w:val="905"/>
+    <w:basedOn w:val="909"/>
     <w:uiPriority w:val="99"/>
     <w:pPr>
       <w:pBdr/>
@@ -32165,9 +32281,9 @@
       </w:tcPr>
     </w:tblStylePr>
   </w:style>
-  <w:style w:type="table" w:styleId="829">
+  <w:style w:type="table" w:styleId="833">
     <w:name w:val="Lined - Accent 5"/>
-    <w:basedOn w:val="905"/>
+    <w:basedOn w:val="909"/>
     <w:uiPriority w:val="99"/>
     <w:pPr>
       <w:pBdr/>
@@ -32402,9 +32518,9 @@
       </w:tcPr>
     </w:tblStylePr>
   </w:style>
-  <w:style w:type="table" w:styleId="830">
+  <w:style w:type="table" w:styleId="834">
     <w:name w:val="Lined - Accent 6"/>
-    <w:basedOn w:val="905"/>
+    <w:basedOn w:val="909"/>
     <w:uiPriority w:val="99"/>
     <w:pPr>
       <w:pBdr/>
@@ -32639,9 +32755,9 @@
       </w:tcPr>
     </w:tblStylePr>
   </w:style>
-  <w:style w:type="table" w:styleId="831">
+  <w:style w:type="table" w:styleId="835">
     <w:name w:val="Bordered &amp; Lined - Accent"/>
-    <w:basedOn w:val="905"/>
+    <w:basedOn w:val="909"/>
     <w:uiPriority w:val="99"/>
     <w:pPr>
       <w:pBdr/>
@@ -32883,9 +32999,9 @@
       </w:tcPr>
     </w:tblStylePr>
   </w:style>
-  <w:style w:type="table" w:styleId="832">
+  <w:style w:type="table" w:styleId="836">
     <w:name w:val="Bordered &amp; Lined - Accent 1"/>
-    <w:basedOn w:val="905"/>
+    <w:basedOn w:val="909"/>
     <w:uiPriority w:val="99"/>
     <w:pPr>
       <w:pBdr/>
@@ -33127,9 +33243,9 @@
       </w:tcPr>
     </w:tblStylePr>
   </w:style>
-  <w:style w:type="table" w:styleId="833">
+  <w:style w:type="table" w:styleId="837">
     <w:name w:val="Bordered &amp; Lined - Accent 2"/>
-    <w:basedOn w:val="905"/>
+    <w:basedOn w:val="909"/>
     <w:uiPriority w:val="99"/>
     <w:pPr>
       <w:pBdr/>
@@ -33371,9 +33487,9 @@
       </w:tcPr>
     </w:tblStylePr>
   </w:style>
-  <w:style w:type="table" w:styleId="834">
+  <w:style w:type="table" w:styleId="838">
     <w:name w:val="Bordered &amp; Lined - Accent 3"/>
-    <w:basedOn w:val="905"/>
+    <w:basedOn w:val="909"/>
     <w:uiPriority w:val="99"/>
     <w:pPr>
       <w:pBdr/>
@@ -33615,9 +33731,9 @@
       </w:tcPr>
     </w:tblStylePr>
   </w:style>
-  <w:style w:type="table" w:styleId="835">
+  <w:style w:type="table" w:styleId="839">
     <w:name w:val="Bordered &amp; Lined - Accent 4"/>
-    <w:basedOn w:val="905"/>
+    <w:basedOn w:val="909"/>
     <w:uiPriority w:val="99"/>
     <w:pPr>
       <w:pBdr/>
@@ -33859,9 +33975,9 @@
       </w:tcPr>
     </w:tblStylePr>
   </w:style>
-  <w:style w:type="table" w:styleId="836">
+  <w:style w:type="table" w:styleId="840">
     <w:name w:val="Bordered &amp; Lined - Accent 5"/>
-    <w:basedOn w:val="905"/>
+    <w:basedOn w:val="909"/>
     <w:uiPriority w:val="99"/>
     <w:pPr>
       <w:pBdr/>
@@ -34103,9 +34219,9 @@
       </w:tcPr>
     </w:tblStylePr>
   </w:style>
-  <w:style w:type="table" w:styleId="837">
+  <w:style w:type="table" w:styleId="841">
     <w:name w:val="Bordered &amp; Lined - Accent 6"/>
-    <w:basedOn w:val="905"/>
+    <w:basedOn w:val="909"/>
     <w:uiPriority w:val="99"/>
     <w:pPr>
       <w:pBdr/>
@@ -34347,9 +34463,9 @@
       </w:tcPr>
     </w:tblStylePr>
   </w:style>
-  <w:style w:type="table" w:styleId="838">
+  <w:style w:type="table" w:styleId="842">
     <w:name w:val="Bordered"/>
-    <w:basedOn w:val="905"/>
+    <w:basedOn w:val="909"/>
     <w:uiPriority w:val="99"/>
     <w:pPr>
       <w:pBdr/>
@@ -34578,9 +34694,9 @@
       </w:tcPr>
     </w:tblStylePr>
   </w:style>
-  <w:style w:type="table" w:styleId="839">
+  <w:style w:type="table" w:styleId="843">
     <w:name w:val="Bordered - Accent 1"/>
-    <w:basedOn w:val="905"/>
+    <w:basedOn w:val="909"/>
     <w:uiPriority w:val="99"/>
     <w:pPr>
       <w:pBdr/>
@@ -34809,9 +34925,9 @@
       </w:tcPr>
     </w:tblStylePr>
   </w:style>
-  <w:style w:type="table" w:styleId="840">
+  <w:style w:type="table" w:styleId="844">
     <w:name w:val="Bordered - Accent 2"/>
-    <w:basedOn w:val="905"/>
+    <w:basedOn w:val="909"/>
     <w:uiPriority w:val="99"/>
     <w:pPr>
       <w:pBdr/>
@@ -35040,9 +35156,9 @@
       </w:tcPr>
     </w:tblStylePr>
   </w:style>
-  <w:style w:type="table" w:styleId="841">
+  <w:style w:type="table" w:styleId="845">
     <w:name w:val="Bordered - Accent 3"/>
-    <w:basedOn w:val="905"/>
+    <w:basedOn w:val="909"/>
     <w:uiPriority w:val="99"/>
     <w:pPr>
       <w:pBdr/>
@@ -35271,9 +35387,9 @@
       </w:tcPr>
     </w:tblStylePr>
   </w:style>
-  <w:style w:type="table" w:styleId="842">
+  <w:style w:type="table" w:styleId="846">
     <w:name w:val="Bordered - Accent 4"/>
-    <w:basedOn w:val="905"/>
+    <w:basedOn w:val="909"/>
     <w:uiPriority w:val="99"/>
     <w:pPr>
       <w:pBdr/>
@@ -35502,9 +35618,9 @@
       </w:tcPr>
     </w:tblStylePr>
   </w:style>
-  <w:style w:type="table" w:styleId="843">
+  <w:style w:type="table" w:styleId="847">
     <w:name w:val="Bordered - Accent 5"/>
-    <w:basedOn w:val="905"/>
+    <w:basedOn w:val="909"/>
     <w:uiPriority w:val="99"/>
     <w:pPr>
       <w:pBdr/>
@@ -35733,9 +35849,9 @@
       </w:tcPr>
     </w:tblStylePr>
   </w:style>
-  <w:style w:type="table" w:styleId="844">
+  <w:style w:type="table" w:styleId="848">
     <w:name w:val="Bordered - Accent 6"/>
-    <w:basedOn w:val="905"/>
+    <w:basedOn w:val="909"/>
     <w:uiPriority w:val="99"/>
     <w:pPr>
       <w:pBdr/>
@@ -35964,11 +36080,11 @@
       </w:tcPr>
     </w:tblStylePr>
   </w:style>
-  <w:style w:type="paragraph" w:styleId="845">
+  <w:style w:type="paragraph" w:styleId="849">
     <w:name w:val="Heading 1"/>
-    <w:basedOn w:val="904"/>
-    <w:next w:val="904"/>
-    <w:link w:val="855"/>
+    <w:basedOn w:val="908"/>
+    <w:next w:val="908"/>
+    <w:link w:val="859"/>
     <w:uiPriority w:val="9"/>
     <w:qFormat/>
     <w:pPr>
@@ -35986,11 +36102,11 @@
       <w:szCs w:val="40"/>
     </w:rPr>
   </w:style>
-  <w:style w:type="paragraph" w:styleId="846">
+  <w:style w:type="paragraph" w:styleId="850">
     <w:name w:val="Heading 2"/>
-    <w:basedOn w:val="904"/>
-    <w:next w:val="904"/>
-    <w:link w:val="856"/>
+    <w:basedOn w:val="908"/>
+    <w:next w:val="908"/>
+    <w:link w:val="860"/>
     <w:uiPriority w:val="9"/>
     <w:unhideWhenUsed/>
     <w:qFormat/>
@@ -36009,11 +36125,11 @@
       <w:szCs w:val="32"/>
     </w:rPr>
   </w:style>
-  <w:style w:type="paragraph" w:styleId="847">
+  <w:style w:type="paragraph" w:styleId="851">
     <w:name w:val="Heading 3"/>
-    <w:basedOn w:val="904"/>
-    <w:next w:val="904"/>
-    <w:link w:val="857"/>
+    <w:basedOn w:val="908"/>
+    <w:next w:val="908"/>
+    <w:link w:val="861"/>
     <w:uiPriority w:val="9"/>
     <w:unhideWhenUsed/>
     <w:qFormat/>
@@ -36032,11 +36148,11 @@
       <w:szCs w:val="28"/>
     </w:rPr>
   </w:style>
-  <w:style w:type="paragraph" w:styleId="848">
+  <w:style w:type="paragraph" w:styleId="852">
     <w:name w:val="Heading 4"/>
-    <w:basedOn w:val="904"/>
-    <w:next w:val="904"/>
-    <w:link w:val="858"/>
+    <w:basedOn w:val="908"/>
+    <w:next w:val="908"/>
+    <w:link w:val="862"/>
     <w:uiPriority w:val="9"/>
     <w:unhideWhenUsed/>
     <w:qFormat/>
@@ -36055,11 +36171,11 @@
       <w:color w:val="0f4761" w:themeColor="accent1" w:themeShade="BF"/>
     </w:rPr>
   </w:style>
-  <w:style w:type="paragraph" w:styleId="849">
+  <w:style w:type="paragraph" w:styleId="853">
     <w:name w:val="Heading 5"/>
-    <w:basedOn w:val="904"/>
-    <w:next w:val="904"/>
-    <w:link w:val="859"/>
+    <w:basedOn w:val="908"/>
+    <w:next w:val="908"/>
+    <w:link w:val="863"/>
     <w:uiPriority w:val="9"/>
     <w:unhideWhenUsed/>
     <w:qFormat/>
@@ -36076,11 +36192,11 @@
       <w:color w:val="0f4761" w:themeColor="accent1" w:themeShade="BF"/>
     </w:rPr>
   </w:style>
-  <w:style w:type="paragraph" w:styleId="850">
+  <w:style w:type="paragraph" w:styleId="854">
     <w:name w:val="Heading 6"/>
-    <w:basedOn w:val="904"/>
-    <w:next w:val="904"/>
-    <w:link w:val="860"/>
+    <w:basedOn w:val="908"/>
+    <w:next w:val="908"/>
+    <w:link w:val="864"/>
     <w:uiPriority w:val="9"/>
     <w:unhideWhenUsed/>
     <w:qFormat/>
@@ -36099,11 +36215,11 @@
       <w:color w:val="595959" w:themeColor="text1" w:themeTint="A6"/>
     </w:rPr>
   </w:style>
-  <w:style w:type="paragraph" w:styleId="851">
+  <w:style w:type="paragraph" w:styleId="855">
     <w:name w:val="Heading 7"/>
-    <w:basedOn w:val="904"/>
-    <w:next w:val="904"/>
-    <w:link w:val="861"/>
+    <w:basedOn w:val="908"/>
+    <w:next w:val="908"/>
+    <w:link w:val="865"/>
     <w:uiPriority w:val="9"/>
     <w:unhideWhenUsed/>
     <w:qFormat/>
@@ -36120,11 +36236,11 @@
       <w:color w:val="595959" w:themeColor="text1" w:themeTint="A6"/>
     </w:rPr>
   </w:style>
-  <w:style w:type="paragraph" w:styleId="852">
+  <w:style w:type="paragraph" w:styleId="856">
     <w:name w:val="Heading 8"/>
-    <w:basedOn w:val="904"/>
-    <w:next w:val="904"/>
-    <w:link w:val="862"/>
+    <w:basedOn w:val="908"/>
+    <w:next w:val="908"/>
+    <w:link w:val="866"/>
     <w:uiPriority w:val="9"/>
     <w:unhideWhenUsed/>
     <w:qFormat/>
@@ -36143,11 +36259,11 @@
       <w:color w:val="272727" w:themeColor="text1" w:themeTint="D8"/>
     </w:rPr>
   </w:style>
-  <w:style w:type="paragraph" w:styleId="853">
+  <w:style w:type="paragraph" w:styleId="857">
     <w:name w:val="Heading 9"/>
-    <w:basedOn w:val="904"/>
-    <w:next w:val="904"/>
-    <w:link w:val="863"/>
+    <w:basedOn w:val="908"/>
+    <w:next w:val="908"/>
+    <w:link w:val="867"/>
     <w:uiPriority w:val="9"/>
     <w:unhideWhenUsed/>
     <w:qFormat/>
@@ -36166,7 +36282,7 @@
       <w:color w:val="272727" w:themeColor="text1" w:themeTint="D8"/>
     </w:rPr>
   </w:style>
-  <w:style w:type="character" w:styleId="854" w:default="1">
+  <w:style w:type="character" w:styleId="858" w:default="1">
     <w:name w:val="Default Paragraph Font"/>
     <w:uiPriority w:val="1"/>
     <w:semiHidden/>
@@ -36177,10 +36293,10 @@
       <w:ind/>
     </w:pPr>
   </w:style>
-  <w:style w:type="character" w:styleId="855">
+  <w:style w:type="character" w:styleId="859">
     <w:name w:val="Heading 1 Char"/>
-    <w:basedOn w:val="854"/>
-    <w:link w:val="845"/>
+    <w:basedOn w:val="858"/>
+    <w:link w:val="849"/>
     <w:uiPriority w:val="9"/>
     <w:pPr>
       <w:pBdr/>
@@ -36194,10 +36310,10 @@
       <w:szCs w:val="40"/>
     </w:rPr>
   </w:style>
-  <w:style w:type="character" w:styleId="856">
+  <w:style w:type="character" w:styleId="860">
     <w:name w:val="Heading 2 Char"/>
-    <w:basedOn w:val="854"/>
-    <w:link w:val="846"/>
+    <w:basedOn w:val="858"/>
+    <w:link w:val="850"/>
     <w:uiPriority w:val="9"/>
     <w:pPr>
       <w:pBdr/>
@@ -36211,10 +36327,10 @@
       <w:szCs w:val="32"/>
     </w:rPr>
   </w:style>
-  <w:style w:type="character" w:styleId="857">
+  <w:style w:type="character" w:styleId="861">
     <w:name w:val="Heading 3 Char"/>
-    <w:basedOn w:val="854"/>
-    <w:link w:val="847"/>
+    <w:basedOn w:val="858"/>
+    <w:link w:val="851"/>
     <w:uiPriority w:val="9"/>
     <w:pPr>
       <w:pBdr/>
@@ -36228,10 +36344,10 @@
       <w:szCs w:val="28"/>
     </w:rPr>
   </w:style>
-  <w:style w:type="character" w:styleId="858">
+  <w:style w:type="character" w:styleId="862">
     <w:name w:val="Heading 4 Char"/>
-    <w:basedOn w:val="854"/>
-    <w:link w:val="848"/>
+    <w:basedOn w:val="858"/>
+    <w:link w:val="852"/>
     <w:uiPriority w:val="9"/>
     <w:pPr>
       <w:pBdr/>
@@ -36245,10 +36361,10 @@
       <w:color w:val="0f4761" w:themeColor="accent1" w:themeShade="BF"/>
     </w:rPr>
   </w:style>
-  <w:style w:type="character" w:styleId="859">
+  <w:style w:type="character" w:styleId="863">
     <w:name w:val="Heading 5 Char"/>
-    <w:basedOn w:val="854"/>
-    <w:link w:val="849"/>
+    <w:basedOn w:val="858"/>
+    <w:link w:val="853"/>
     <w:uiPriority w:val="9"/>
     <w:pPr>
       <w:pBdr/>
@@ -36260,10 +36376,10 @@
       <w:color w:val="0f4761" w:themeColor="accent1" w:themeShade="BF"/>
     </w:rPr>
   </w:style>
-  <w:style w:type="character" w:styleId="860">
+  <w:style w:type="character" w:styleId="864">
     <w:name w:val="Heading 6 Char"/>
-    <w:basedOn w:val="854"/>
-    <w:link w:val="850"/>
+    <w:basedOn w:val="858"/>
+    <w:link w:val="854"/>
     <w:uiPriority w:val="9"/>
     <w:pPr>
       <w:pBdr/>
@@ -36277,10 +36393,10 @@
       <w:color w:val="595959" w:themeColor="text1" w:themeTint="A6"/>
     </w:rPr>
   </w:style>
-  <w:style w:type="character" w:styleId="861">
+  <w:style w:type="character" w:styleId="865">
     <w:name w:val="Heading 7 Char"/>
-    <w:basedOn w:val="854"/>
-    <w:link w:val="851"/>
+    <w:basedOn w:val="858"/>
+    <w:link w:val="855"/>
     <w:uiPriority w:val="9"/>
     <w:pPr>
       <w:pBdr/>
@@ -36292,10 +36408,10 @@
       <w:color w:val="595959" w:themeColor="text1" w:themeTint="A6"/>
     </w:rPr>
   </w:style>
-  <w:style w:type="character" w:styleId="862">
+  <w:style w:type="character" w:styleId="866">
     <w:name w:val="Heading 8 Char"/>
-    <w:basedOn w:val="854"/>
-    <w:link w:val="852"/>
+    <w:basedOn w:val="858"/>
+    <w:link w:val="856"/>
     <w:uiPriority w:val="9"/>
     <w:pPr>
       <w:pBdr/>
@@ -36309,10 +36425,10 @@
       <w:color w:val="272727" w:themeColor="text1" w:themeTint="D8"/>
     </w:rPr>
   </w:style>
-  <w:style w:type="character" w:styleId="863">
+  <w:style w:type="character" w:styleId="867">
     <w:name w:val="Heading 9 Char"/>
-    <w:basedOn w:val="854"/>
-    <w:link w:val="853"/>
+    <w:basedOn w:val="858"/>
+    <w:link w:val="857"/>
     <w:uiPriority w:val="9"/>
     <w:pPr>
       <w:pBdr/>
@@ -36326,11 +36442,11 @@
       <w:color w:val="272727" w:themeColor="text1" w:themeTint="D8"/>
     </w:rPr>
   </w:style>
-  <w:style w:type="paragraph" w:styleId="864">
+  <w:style w:type="paragraph" w:styleId="868">
     <w:name w:val="Title"/>
-    <w:basedOn w:val="904"/>
-    <w:next w:val="904"/>
-    <w:link w:val="865"/>
+    <w:basedOn w:val="908"/>
+    <w:next w:val="908"/>
+    <w:link w:val="869"/>
     <w:uiPriority w:val="10"/>
     <w:qFormat/>
     <w:pPr>
@@ -36346,10 +36462,10 @@
       <w:szCs w:val="56"/>
     </w:rPr>
   </w:style>
-  <w:style w:type="character" w:styleId="865">
+  <w:style w:type="character" w:styleId="869">
     <w:name w:val="Title Char"/>
-    <w:basedOn w:val="854"/>
-    <w:link w:val="864"/>
+    <w:basedOn w:val="858"/>
+    <w:link w:val="868"/>
     <w:uiPriority w:val="10"/>
     <w:pPr>
       <w:pBdr/>
@@ -36363,11 +36479,11 @@
       <w:szCs w:val="56"/>
     </w:rPr>
   </w:style>
-  <w:style w:type="paragraph" w:styleId="866">
+  <w:style w:type="paragraph" w:styleId="870">
     <w:name w:val="Subtitle"/>
-    <w:basedOn w:val="904"/>
-    <w:next w:val="904"/>
-    <w:link w:val="867"/>
+    <w:basedOn w:val="908"/>
+    <w:next w:val="908"/>
+    <w:link w:val="871"/>
     <w:uiPriority w:val="11"/>
     <w:qFormat/>
     <w:pPr>
@@ -36385,10 +36501,10 @@
       <w:szCs w:val="28"/>
     </w:rPr>
   </w:style>
-  <w:style w:type="character" w:styleId="867">
+  <w:style w:type="character" w:styleId="871">
     <w:name w:val="Subtitle Char"/>
-    <w:basedOn w:val="854"/>
-    <w:link w:val="866"/>
+    <w:basedOn w:val="858"/>
+    <w:link w:val="870"/>
     <w:uiPriority w:val="11"/>
     <w:pPr>
       <w:pBdr/>
@@ -36402,11 +36518,11 @@
       <w:szCs w:val="28"/>
     </w:rPr>
   </w:style>
-  <w:style w:type="paragraph" w:styleId="868">
+  <w:style w:type="paragraph" w:styleId="872">
     <w:name w:val="Quote"/>
-    <w:basedOn w:val="904"/>
-    <w:next w:val="904"/>
-    <w:link w:val="869"/>
+    <w:basedOn w:val="908"/>
+    <w:next w:val="908"/>
+    <w:link w:val="873"/>
     <w:uiPriority w:val="29"/>
     <w:qFormat/>
     <w:pPr>
@@ -36421,10 +36537,10 @@
       <w:color w:val="404040" w:themeColor="text1" w:themeTint="BF"/>
     </w:rPr>
   </w:style>
-  <w:style w:type="character" w:styleId="869">
+  <w:style w:type="character" w:styleId="873">
     <w:name w:val="Quote Char"/>
-    <w:basedOn w:val="854"/>
-    <w:link w:val="868"/>
+    <w:basedOn w:val="858"/>
+    <w:link w:val="872"/>
     <w:uiPriority w:val="29"/>
     <w:pPr>
       <w:pBdr/>
@@ -36437,9 +36553,9 @@
       <w:color w:val="404040" w:themeColor="text1" w:themeTint="BF"/>
     </w:rPr>
   </w:style>
-  <w:style w:type="character" w:styleId="870">
+  <w:style w:type="character" w:styleId="874">
     <w:name w:val="Intense Emphasis"/>
-    <w:basedOn w:val="854"/>
+    <w:basedOn w:val="858"/>
     <w:uiPriority w:val="21"/>
     <w:qFormat/>
     <w:pPr>
@@ -36453,11 +36569,11 @@
       <w:color w:val="0f4761" w:themeColor="accent1" w:themeShade="BF"/>
     </w:rPr>
   </w:style>
-  <w:style w:type="paragraph" w:styleId="871">
+  <w:style w:type="paragraph" w:styleId="875">
     <w:name w:val="Intense Quote"/>
-    <w:basedOn w:val="904"/>
-    <w:next w:val="904"/>
-    <w:link w:val="872"/>
+    <w:basedOn w:val="908"/>
+    <w:next w:val="908"/>
+    <w:link w:val="876"/>
     <w:uiPriority w:val="30"/>
     <w:qFormat/>
     <w:pPr>
@@ -36475,10 +36591,10 @@
       <w:color w:val="0f4761" w:themeColor="accent1" w:themeShade="BF"/>
     </w:rPr>
   </w:style>
-  <w:style w:type="character" w:styleId="872">
+  <w:style w:type="character" w:styleId="876">
     <w:name w:val="Intense Quote Char"/>
-    <w:basedOn w:val="854"/>
-    <w:link w:val="871"/>
+    <w:basedOn w:val="858"/>
+    <w:link w:val="875"/>
     <w:uiPriority w:val="30"/>
     <w:pPr>
       <w:pBdr/>
@@ -36491,9 +36607,9 @@
       <w:color w:val="0f4761" w:themeColor="accent1" w:themeShade="BF"/>
     </w:rPr>
   </w:style>
-  <w:style w:type="character" w:styleId="873">
+  <w:style w:type="character" w:styleId="877">
     <w:name w:val="Intense Reference"/>
-    <w:basedOn w:val="854"/>
+    <w:basedOn w:val="858"/>
     <w:uiPriority w:val="32"/>
     <w:qFormat/>
     <w:pPr>
@@ -36509,9 +36625,9 @@
       <w:spacing w:val="5"/>
     </w:rPr>
   </w:style>
-  <w:style w:type="character" w:styleId="874">
+  <w:style w:type="character" w:styleId="878">
     <w:name w:val="Subtle Emphasis"/>
-    <w:basedOn w:val="854"/>
+    <w:basedOn w:val="858"/>
     <w:uiPriority w:val="19"/>
     <w:qFormat/>
     <w:pPr>
@@ -36525,9 +36641,9 @@
       <w:color w:val="404040" w:themeColor="text1" w:themeTint="BF"/>
     </w:rPr>
   </w:style>
-  <w:style w:type="character" w:styleId="875">
+  <w:style w:type="character" w:styleId="879">
     <w:name w:val="Emphasis"/>
-    <w:basedOn w:val="854"/>
+    <w:basedOn w:val="858"/>
     <w:uiPriority w:val="20"/>
     <w:qFormat/>
     <w:pPr>
@@ -36540,9 +36656,9 @@
       <w:iCs/>
     </w:rPr>
   </w:style>
-  <w:style w:type="character" w:styleId="876">
+  <w:style w:type="character" w:styleId="880">
     <w:name w:val="Strong"/>
-    <w:basedOn w:val="854"/>
+    <w:basedOn w:val="858"/>
     <w:uiPriority w:val="22"/>
     <w:qFormat/>
     <w:pPr>
@@ -36555,9 +36671,9 @@
       <w:bCs/>
     </w:rPr>
   </w:style>
-  <w:style w:type="character" w:styleId="877">
+  <w:style w:type="character" w:styleId="881">
     <w:name w:val="Subtle Reference"/>
-    <w:basedOn w:val="854"/>
+    <w:basedOn w:val="858"/>
     <w:uiPriority w:val="31"/>
     <w:qFormat/>
     <w:pPr>
@@ -36570,9 +36686,9 @@
       <w:color w:val="5a5a5a" w:themeColor="text1" w:themeTint="A5"/>
     </w:rPr>
   </w:style>
-  <w:style w:type="character" w:styleId="878">
+  <w:style w:type="character" w:styleId="882">
     <w:name w:val="Book Title"/>
-    <w:basedOn w:val="854"/>
+    <w:basedOn w:val="858"/>
     <w:uiPriority w:val="33"/>
     <w:qFormat/>
     <w:pPr>
@@ -36588,10 +36704,10 @@
       <w:spacing w:val="5"/>
     </w:rPr>
   </w:style>
-  <w:style w:type="paragraph" w:styleId="879">
+  <w:style w:type="paragraph" w:styleId="883">
     <w:name w:val="Header"/>
-    <w:basedOn w:val="904"/>
-    <w:link w:val="880"/>
+    <w:basedOn w:val="908"/>
+    <w:link w:val="884"/>
     <w:uiPriority w:val="99"/>
     <w:unhideWhenUsed/>
     <w:pPr>
@@ -36604,10 +36720,10 @@
       <w:ind/>
     </w:pPr>
   </w:style>
-  <w:style w:type="character" w:styleId="880">
+  <w:style w:type="character" w:styleId="884">
     <w:name w:val="Header Char"/>
-    <w:basedOn w:val="854"/>
-    <w:link w:val="879"/>
+    <w:basedOn w:val="858"/>
+    <w:link w:val="883"/>
     <w:uiPriority w:val="99"/>
     <w:pPr>
       <w:pBdr/>
@@ -36615,10 +36731,10 @@
       <w:ind/>
     </w:pPr>
   </w:style>
-  <w:style w:type="paragraph" w:styleId="881">
+  <w:style w:type="paragraph" w:styleId="885">
     <w:name w:val="Footer"/>
-    <w:basedOn w:val="904"/>
-    <w:link w:val="882"/>
+    <w:basedOn w:val="908"/>
+    <w:link w:val="886"/>
     <w:uiPriority w:val="99"/>
     <w:unhideWhenUsed/>
     <w:pPr>
@@ -36631,10 +36747,10 @@
       <w:ind/>
     </w:pPr>
   </w:style>
-  <w:style w:type="character" w:styleId="882">
+  <w:style w:type="character" w:styleId="886">
     <w:name w:val="Footer Char"/>
-    <w:basedOn w:val="854"/>
-    <w:link w:val="881"/>
+    <w:basedOn w:val="858"/>
+    <w:link w:val="885"/>
     <w:uiPriority w:val="99"/>
     <w:pPr>
       <w:pBdr/>
@@ -36642,10 +36758,10 @@
       <w:ind/>
     </w:pPr>
   </w:style>
-  <w:style w:type="paragraph" w:styleId="883">
+  <w:style w:type="paragraph" w:styleId="887">
     <w:name w:val="Caption"/>
-    <w:basedOn w:val="904"/>
-    <w:next w:val="904"/>
+    <w:basedOn w:val="908"/>
+    <w:next w:val="908"/>
     <w:uiPriority w:val="35"/>
     <w:unhideWhenUsed/>
     <w:qFormat/>
@@ -36662,10 +36778,10 @@
       <w:szCs w:val="18"/>
     </w:rPr>
   </w:style>
-  <w:style w:type="paragraph" w:styleId="884">
+  <w:style w:type="paragraph" w:styleId="888">
     <w:name w:val="footnote text"/>
-    <w:basedOn w:val="904"/>
-    <w:link w:val="885"/>
+    <w:basedOn w:val="908"/>
+    <w:link w:val="889"/>
     <w:uiPriority w:val="99"/>
     <w:semiHidden/>
     <w:unhideWhenUsed/>
@@ -36679,10 +36795,10 @@
       <w:szCs w:val="20"/>
     </w:rPr>
   </w:style>
-  <w:style w:type="character" w:styleId="885">
+  <w:style w:type="character" w:styleId="889">
     <w:name w:val="Footnote Text Char"/>
-    <w:basedOn w:val="854"/>
-    <w:link w:val="884"/>
+    <w:basedOn w:val="858"/>
+    <w:link w:val="888"/>
     <w:uiPriority w:val="99"/>
     <w:semiHidden/>
     <w:pPr>
@@ -36695,9 +36811,9 @@
       <w:szCs w:val="20"/>
     </w:rPr>
   </w:style>
-  <w:style w:type="character" w:styleId="886">
+  <w:style w:type="character" w:styleId="890">
     <w:name w:val="footnote reference"/>
-    <w:basedOn w:val="854"/>
+    <w:basedOn w:val="858"/>
     <w:uiPriority w:val="99"/>
     <w:semiHidden/>
     <w:unhideWhenUsed/>
@@ -36710,10 +36826,10 @@
       <w:vertAlign w:val="superscript"/>
     </w:rPr>
   </w:style>
-  <w:style w:type="paragraph" w:styleId="887">
+  <w:style w:type="paragraph" w:styleId="891">
     <w:name w:val="endnote text"/>
-    <w:basedOn w:val="904"/>
-    <w:link w:val="888"/>
+    <w:basedOn w:val="908"/>
+    <w:link w:val="892"/>
     <w:uiPriority w:val="99"/>
     <w:semiHidden/>
     <w:unhideWhenUsed/>
@@ -36727,10 +36843,10 @@
       <w:szCs w:val="20"/>
     </w:rPr>
   </w:style>
-  <w:style w:type="character" w:styleId="888">
+  <w:style w:type="character" w:styleId="892">
     <w:name w:val="Endnote Text Char"/>
-    <w:basedOn w:val="854"/>
-    <w:link w:val="887"/>
+    <w:basedOn w:val="858"/>
+    <w:link w:val="891"/>
     <w:uiPriority w:val="99"/>
     <w:semiHidden/>
     <w:pPr>
@@ -36743,9 +36859,9 @@
       <w:szCs w:val="20"/>
     </w:rPr>
   </w:style>
-  <w:style w:type="character" w:styleId="889">
+  <w:style w:type="character" w:styleId="893">
     <w:name w:val="endnote reference"/>
-    <w:basedOn w:val="854"/>
+    <w:basedOn w:val="858"/>
     <w:uiPriority w:val="99"/>
     <w:semiHidden/>
     <w:unhideWhenUsed/>
@@ -36758,9 +36874,9 @@
       <w:vertAlign w:val="superscript"/>
     </w:rPr>
   </w:style>
-  <w:style w:type="character" w:styleId="890">
+  <w:style w:type="character" w:styleId="894">
     <w:name w:val="Hyperlink"/>
-    <w:basedOn w:val="854"/>
+    <w:basedOn w:val="858"/>
     <w:uiPriority w:val="99"/>
     <w:unhideWhenUsed/>
     <w:pPr>
@@ -36773,9 +36889,9 @@
       <w:u w:val="single"/>
     </w:rPr>
   </w:style>
-  <w:style w:type="character" w:styleId="891">
+  <w:style w:type="character" w:styleId="895">
     <w:name w:val="FollowedHyperlink"/>
-    <w:basedOn w:val="854"/>
+    <w:basedOn w:val="858"/>
     <w:uiPriority w:val="99"/>
     <w:semiHidden/>
     <w:unhideWhenUsed/>
@@ -36789,10 +36905,10 @@
       <w:u w:val="single"/>
     </w:rPr>
   </w:style>
-  <w:style w:type="paragraph" w:styleId="892">
+  <w:style w:type="paragraph" w:styleId="896">
     <w:name w:val="toc 1"/>
-    <w:basedOn w:val="904"/>
-    <w:next w:val="904"/>
+    <w:basedOn w:val="908"/>
+    <w:next w:val="908"/>
     <w:uiPriority w:val="39"/>
     <w:unhideWhenUsed/>
     <w:pPr>
@@ -36801,10 +36917,10 @@
       <w:ind/>
     </w:pPr>
   </w:style>
-  <w:style w:type="paragraph" w:styleId="893">
+  <w:style w:type="paragraph" w:styleId="897">
     <w:name w:val="toc 2"/>
-    <w:basedOn w:val="904"/>
-    <w:next w:val="904"/>
+    <w:basedOn w:val="908"/>
+    <w:next w:val="908"/>
     <w:uiPriority w:val="39"/>
     <w:unhideWhenUsed/>
     <w:pPr>
@@ -36813,10 +36929,10 @@
       <w:ind w:left="220"/>
     </w:pPr>
   </w:style>
-  <w:style w:type="paragraph" w:styleId="894">
+  <w:style w:type="paragraph" w:styleId="898">
     <w:name w:val="toc 3"/>
-    <w:basedOn w:val="904"/>
-    <w:next w:val="904"/>
+    <w:basedOn w:val="908"/>
+    <w:next w:val="908"/>
     <w:uiPriority w:val="39"/>
     <w:unhideWhenUsed/>
     <w:pPr>
@@ -36825,10 +36941,10 @@
       <w:ind w:left="440"/>
     </w:pPr>
   </w:style>
-  <w:style w:type="paragraph" w:styleId="895">
+  <w:style w:type="paragraph" w:styleId="899">
     <w:name w:val="toc 4"/>
-    <w:basedOn w:val="904"/>
-    <w:next w:val="904"/>
+    <w:basedOn w:val="908"/>
+    <w:next w:val="908"/>
     <w:uiPriority w:val="39"/>
     <w:unhideWhenUsed/>
     <w:pPr>
@@ -36837,10 +36953,10 @@
       <w:ind w:left="660"/>
     </w:pPr>
   </w:style>
-  <w:style w:type="paragraph" w:styleId="896">
+  <w:style w:type="paragraph" w:styleId="900">
     <w:name w:val="toc 5"/>
-    <w:basedOn w:val="904"/>
-    <w:next w:val="904"/>
+    <w:basedOn w:val="908"/>
+    <w:next w:val="908"/>
     <w:uiPriority w:val="39"/>
     <w:unhideWhenUsed/>
     <w:pPr>
@@ -36849,10 +36965,10 @@
       <w:ind w:left="880"/>
     </w:pPr>
   </w:style>
-  <w:style w:type="paragraph" w:styleId="897">
+  <w:style w:type="paragraph" w:styleId="901">
     <w:name w:val="toc 6"/>
-    <w:basedOn w:val="904"/>
-    <w:next w:val="904"/>
+    <w:basedOn w:val="908"/>
+    <w:next w:val="908"/>
     <w:uiPriority w:val="39"/>
     <w:unhideWhenUsed/>
     <w:pPr>
@@ -36861,10 +36977,10 @@
       <w:ind w:left="1100"/>
     </w:pPr>
   </w:style>
-  <w:style w:type="paragraph" w:styleId="898">
+  <w:style w:type="paragraph" w:styleId="902">
     <w:name w:val="toc 7"/>
-    <w:basedOn w:val="904"/>
-    <w:next w:val="904"/>
+    <w:basedOn w:val="908"/>
+    <w:next w:val="908"/>
     <w:uiPriority w:val="39"/>
     <w:unhideWhenUsed/>
     <w:pPr>
@@ -36873,10 +36989,10 @@
       <w:ind w:left="1320"/>
     </w:pPr>
   </w:style>
-  <w:style w:type="paragraph" w:styleId="899">
+  <w:style w:type="paragraph" w:styleId="903">
     <w:name w:val="toc 8"/>
-    <w:basedOn w:val="904"/>
-    <w:next w:val="904"/>
+    <w:basedOn w:val="908"/>
+    <w:next w:val="908"/>
     <w:uiPriority w:val="39"/>
     <w:unhideWhenUsed/>
     <w:pPr>
@@ -36885,10 +37001,10 @@
       <w:ind w:left="1540"/>
     </w:pPr>
   </w:style>
-  <w:style w:type="paragraph" w:styleId="900">
+  <w:style w:type="paragraph" w:styleId="904">
     <w:name w:val="toc 9"/>
-    <w:basedOn w:val="904"/>
-    <w:next w:val="904"/>
+    <w:basedOn w:val="908"/>
+    <w:next w:val="908"/>
     <w:uiPriority w:val="39"/>
     <w:unhideWhenUsed/>
     <w:pPr>
@@ -36897,9 +37013,9 @@
       <w:ind w:left="1760"/>
     </w:pPr>
   </w:style>
-  <w:style w:type="character" w:styleId="901">
+  <w:style w:type="character" w:styleId="905">
     <w:name w:val="Placeholder Text"/>
-    <w:basedOn w:val="854"/>
+    <w:basedOn w:val="858"/>
     <w:uiPriority w:val="99"/>
     <w:semiHidden/>
     <w:pPr>
@@ -36911,7 +37027,7 @@
       <w:color w:val="666666"/>
     </w:rPr>
   </w:style>
-  <w:style w:type="paragraph" w:styleId="902">
+  <w:style w:type="paragraph" w:styleId="906">
     <w:name w:val="TOC Heading"/>
     <w:uiPriority w:val="39"/>
     <w:unhideWhenUsed/>
@@ -36921,10 +37037,10 @@
       <w:ind/>
     </w:pPr>
   </w:style>
-  <w:style w:type="paragraph" w:styleId="903">
+  <w:style w:type="paragraph" w:styleId="907">
     <w:name w:val="table of figures"/>
-    <w:basedOn w:val="904"/>
-    <w:next w:val="904"/>
+    <w:basedOn w:val="908"/>
+    <w:next w:val="908"/>
     <w:uiPriority w:val="99"/>
     <w:unhideWhenUsed/>
     <w:pPr>
@@ -36933,7 +37049,7 @@
       <w:ind/>
     </w:pPr>
   </w:style>
-  <w:style w:type="paragraph" w:styleId="904" w:default="1">
+  <w:style w:type="paragraph" w:styleId="908" w:default="1">
     <w:name w:val="Normal"/>
     <w:qFormat/>
     <w:pPr>
@@ -36942,7 +37058,7 @@
       <w:ind/>
     </w:pPr>
   </w:style>
-  <w:style w:type="table" w:styleId="905" w:default="1">
+  <w:style w:type="table" w:styleId="909" w:default="1">
     <w:name w:val="Normal Table"/>
     <w:uiPriority w:val="99"/>
     <w:semiHidden/>
@@ -37135,7 +37251,7 @@
       </w:tcPr>
     </w:tblStylePr>
   </w:style>
-  <w:style w:type="numbering" w:styleId="906" w:default="1">
+  <w:style w:type="numbering" w:styleId="910" w:default="1">
     <w:name w:val="No List"/>
     <w:uiPriority w:val="99"/>
     <w:semiHidden/>
@@ -37146,9 +37262,9 @@
       <w:ind/>
     </w:pPr>
   </w:style>
-  <w:style w:type="paragraph" w:styleId="907">
+  <w:style w:type="paragraph" w:styleId="911">
     <w:name w:val="No Spacing"/>
-    <w:basedOn w:val="904"/>
+    <w:basedOn w:val="908"/>
     <w:uiPriority w:val="1"/>
     <w:qFormat/>
     <w:pPr>
@@ -37157,9 +37273,9 @@
       <w:ind/>
     </w:pPr>
   </w:style>
-  <w:style w:type="paragraph" w:styleId="908">
+  <w:style w:type="paragraph" w:styleId="912">
     <w:name w:val="List Paragraph"/>
-    <w:basedOn w:val="904"/>
+    <w:basedOn w:val="908"/>
     <w:uiPriority w:val="34"/>
     <w:qFormat/>
     <w:pPr>

</xml_diff>